<commit_message>
Expand academic portfolio with research notes and public source links
</commit_message>
<xml_diff>
--- a/Chenxu_Wang_Academic_CV.docx
+++ b/Chenxu_Wang_Academic_CV.docx
@@ -127,7 +127,7 @@
           <w:rFonts w:eastAsia="微软雅黑"/>
           <w:b w:val="0"/>
         </w:rPr>
-        <w:t>具身智能、机器人学习、灵巧操作、运动重定向与人机交互。</w:t>
+        <w:t>具身智能、灵巧操作与机器人学习，重点关注异构运动重定向、可穿戴感知及人类示教。</w:t>
       </w:r>
     </w:p>
     <w:p>
@@ -138,7 +138,7 @@
         <w:rPr>
           <w:rFonts w:eastAsia="微软雅黑"/>
         </w:rPr>
-        <w:t>项目经历</w:t>
+        <w:t>研究与工程经历</w:t>
       </w:r>
     </w:p>
     <w:p>
@@ -151,7 +151,7 @@
           <w:rFonts w:eastAsia="微软雅黑"/>
           <w:b/>
         </w:rPr>
-        <w:t>灵巧手遥操作  DOGlove × ORCA  |  2026—至今</w:t>
+        <w:t>灵巧手异构运动重定向  DOGlove × ORCA  |  2026—至今</w:t>
       </w:r>
     </w:p>
     <w:p>
@@ -164,7 +164,7 @@
           <w:rFonts w:eastAsia="微软雅黑"/>
           <w:b w:val="0"/>
         </w:rPr>
-        <w:t>分析人手与机器人手运动学结构及尺寸差异，围绕抓握、捏合动作开展坐标对齐、正逆运动学分析与多姿态标定。</w:t>
+        <w:t>针对构型、指长与零位差异，实现掌坐标下逐指空间映射、平手标定和受关节范围约束的指尖 IK；通过弱姿态偏好分析空间目标与关节姿态的取舍。</w:t>
       </w:r>
     </w:p>
     <w:p>
@@ -179,7 +179,7 @@
           <w:color w:val="505850"/>
           <w:sz w:val="18"/>
         </w:rPr>
-        <w:t>当前进展：运动映射改进与定量验证仍在进行。</w:t>
+        <w:t>整理 223 条逐指记录与保留测试；离线对照中参考关节 RMSE 由 23.56° 降至 23.20°。</w:t>
       </w:r>
     </w:p>
     <w:p>
@@ -205,7 +205,7 @@
           <w:rFonts w:eastAsia="微软雅黑"/>
           <w:b w:val="0"/>
         </w:rPr>
-        <w:t>主要完成 Arduino 传感硬件、BLE 数据采集、手势识别模型训练及软件集成；结合 Wav2Vec2、ASR 与语言模型探索语音情感反馈。</w:t>
+        <w:t>除三维建模与 PPT 外，基本独立完成硬件、Arduino 固件、BLE 采集和随机森林分类；集成 Wav2Vec2/MLP 与 ASR/LLM 双通道分析及显示、振动反馈。</w:t>
       </w:r>
     </w:p>
     <w:p>
@@ -220,7 +220,7 @@
           <w:color w:val="505850"/>
           <w:sz w:val="18"/>
         </w:rPr>
-        <w:t>获未来设计师 NCDA 全国总决赛三等奖，第二作者；三维建模与汇报材料由合作者支持。</w:t>
+        <w:t>形成传感采集—训练—预测流程与实物原型，获未来设计师 NCDA 全国总决赛三等奖，第二作者。</w:t>
       </w:r>
     </w:p>
     <w:p>
@@ -246,7 +246,7 @@
           <w:rFonts w:eastAsia="微软雅黑"/>
           <w:b w:val="0"/>
         </w:rPr>
-        <w:t>负责桌面智能体记忆与决策逻辑，接入华为云 IoTDA，整合实体感知和控制设备，开展智慧空间系统联调与演示。</w:t>
+        <w:t>负责桌面智能体、状态与偏好记忆及决策逻辑，通过华为云 IoTDA 接入实体设备；整合命令解释、动作派发与状态回读，完成系统联调和演示材料。</w:t>
       </w:r>
     </w:p>
     <w:p>
@@ -274,7 +274,7 @@
           <w:rFonts w:eastAsia="微软雅黑"/>
           <w:b/>
         </w:rPr>
-        <w:t>屠龙勇士智能车  |  团队队长</w:t>
+        <w:t>机器人与智能车实践  |  屠龙勇士队长 / 校机器人队</w:t>
       </w:r>
     </w:p>
     <w:p>
@@ -287,7 +287,7 @@
           <w:rFonts w:eastAsia="微软雅黑"/>
           <w:b w:val="0"/>
         </w:rPr>
-        <w:t>带队完成智能车硬件装配、固件调试与赛道测试，整合传感器、电机及控制程序。</w:t>
+        <w:t>完成微控制器智能车的硬件装配、传感器与电机接入、固件调试及赛道测试，积累真实机器人平台的软硬件联调经验。</w:t>
       </w:r>
     </w:p>
     <w:p>
@@ -302,48 +302,7 @@
           <w:color w:val="505850"/>
           <w:sz w:val="18"/>
         </w:rPr>
-        <w:t>获第十一届屠龙勇士智能车大赛校级二等奖。</w:t>
-      </w:r>
-    </w:p>
-    <w:p>
-      <w:pPr>
-        <w:keepNext/>
-        <w:spacing w:after="40"/>
-      </w:pPr>
-      <w:r>
-        <w:rPr>
-          <w:rFonts w:eastAsia="微软雅黑"/>
-          <w:b/>
-        </w:rPr>
-        <w:t>机器人与智能车实践  |  团队项目</w:t>
-      </w:r>
-    </w:p>
-    <w:p>
-      <w:pPr>
-        <w:keepNext/>
-        <w:spacing w:after="40"/>
-      </w:pPr>
-      <w:r>
-        <w:rPr>
-          <w:rFonts w:eastAsia="微软雅黑"/>
-          <w:b w:val="0"/>
-        </w:rPr>
-        <w:t>参与微控制器机器人原型开发，负责电机、传感器、电子线路和控制代码联调，开展实物测试与问题排查。</w:t>
-      </w:r>
-    </w:p>
-    <w:p>
-      <w:pPr>
-        <w:keepNext w:val="0"/>
-        <w:spacing w:after="80"/>
-      </w:pPr>
-      <w:r>
-        <w:rPr>
-          <w:rFonts w:eastAsia="微软雅黑"/>
-          <w:b w:val="0"/>
-          <w:color w:val="505850"/>
-          <w:sz w:val="18"/>
-        </w:rPr>
-        <w:t>机器人竞赛校级三等奖。</w:t>
+        <w:t>第十一届屠龙勇士智能车大赛校二等奖；追梦杯机器人竞赛校三等奖。</w:t>
       </w:r>
     </w:p>
     <w:p>
@@ -367,7 +326,7 @@
           <w:rFonts w:eastAsia="微软雅黑"/>
           <w:b w:val="0"/>
         </w:rPr>
-        <w:t>编程与工具：Python、C/C++、Arduino、Git、Linux、嵌入式调试与数值建模。</w:t>
+        <w:t>项目中使用：Python、C/C++、Arduino、Git、Linux；NumPy、SciPy、scikit-learn、MuJoCo。</w:t>
       </w:r>
     </w:p>
     <w:p>
@@ -380,7 +339,7 @@
           <w:rFonts w:eastAsia="微软雅黑"/>
           <w:b w:val="0"/>
         </w:rPr>
-        <w:t>工程与模型：传感数据采集、BLE 通信、运动学分析、scikit-learn 与模型集成。</w:t>
+        <w:t>实践内容：传感数据采集、BLE 通信、正逆运动学、约束优化、模型集成及实验回放。</w:t>
       </w:r>
     </w:p>
     <w:p>
@@ -405,7 +364,7 @@
           <w:b w:val="0"/>
           <w:sz w:val="18"/>
         </w:rPr>
-        <w:t>国家奖学金  ·  未来设计师 NCDA 全国三等奖  ·  华为 OPC 优秀奖</w:t>
+        <w:t>光电设计竞赛华北区二等奖；蓝桥杯 C/C++ 大学 A 组、码蹄杯北京赛区三等奖。</w:t>
       </w:r>
     </w:p>
     <w:p>
@@ -419,7 +378,7 @@
           <w:b w:val="0"/>
           <w:sz w:val="18"/>
         </w:rPr>
-        <w:t>第十一届屠龙勇士智能车大赛校二等奖  ·  机器人竞赛校三等奖</w:t>
+        <w:t>博约杯物理竞赛校一等奖；CUPT 校内选拔赛、芯火计划集成电路大赛校二等奖。</w:t>
       </w:r>
     </w:p>
     <w:sectPr>

</xml_diff>

<commit_message>
Redesign Chinese academic CV as a one-page two-column resume
</commit_message>
<xml_diff>
--- a/Chenxu_Wang_Academic_CV.docx
+++ b/Chenxu_Wang_Academic_CV.docx
@@ -2,418 +2,1108 @@
 <file path=word/document.xml><?xml version="1.0" encoding="utf-8"?>
 <w:document xmlns:wpc="http://schemas.microsoft.com/office/word/2010/wordprocessingCanvas" xmlns:mo="http://schemas.microsoft.com/office/mac/office/2008/main" xmlns:mc="http://schemas.openxmlformats.org/markup-compatibility/2006" xmlns:mv="urn:schemas-microsoft-com:mac:vml" xmlns:o="urn:schemas-microsoft-com:office:office" xmlns:r="http://schemas.openxmlformats.org/officeDocument/2006/relationships" xmlns:m="http://schemas.openxmlformats.org/officeDocument/2006/math" xmlns:v="urn:schemas-microsoft-com:vml" xmlns:wp14="http://schemas.microsoft.com/office/word/2010/wordprocessingDrawing" xmlns:wp="http://schemas.openxmlformats.org/drawingml/2006/wordprocessingDrawing" xmlns:w10="urn:schemas-microsoft-com:office:word" xmlns:w="http://schemas.openxmlformats.org/wordprocessingml/2006/main" xmlns:w14="http://schemas.microsoft.com/office/word/2010/wordml" xmlns:wpg="http://schemas.microsoft.com/office/word/2010/wordprocessingGroup" xmlns:wpi="http://schemas.microsoft.com/office/word/2010/wordprocessingInk" xmlns:wne="http://schemas.microsoft.com/office/word/2006/wordml" xmlns:wps="http://schemas.microsoft.com/office/word/2010/wordprocessingShape" mc:Ignorable="w14 wp14">
   <w:body>
-    <w:p>
-      <w:pPr>
-        <w:pStyle w:val="Title"/>
-      </w:pPr>
-      <w:r>
-        <w:rPr>
-          <w:rFonts w:eastAsia="微软雅黑"/>
-        </w:rPr>
-        <w:t>王晨旭</w:t>
-      </w:r>
-    </w:p>
-    <w:p>
-      <w:pPr>
-        <w:keepNext w:val="0"/>
-        <w:spacing w:after="60"/>
-      </w:pPr>
-      <w:r>
-        <w:rPr>
-          <w:rFonts w:eastAsia="微软雅黑"/>
-          <w:b w:val="0"/>
-          <w:sz w:val="21"/>
-        </w:rPr>
-        <w:t>Chenxu Wang  |  北京理工大学 · 电子信息工程本科生</w:t>
-      </w:r>
-    </w:p>
-    <w:p>
-      <w:pPr>
-        <w:keepNext w:val="0"/>
-        <w:spacing w:after="40"/>
-      </w:pPr>
-      <w:r>
-        <w:rPr>
-          <w:rFonts w:eastAsia="微软雅黑"/>
-          <w:b w:val="0"/>
-          <w:sz w:val="18"/>
-        </w:rPr>
-        <w:t>chenxuwang.chn@outlook.com  |  github.com/LucianWangChn</w:t>
-      </w:r>
-    </w:p>
-    <w:p>
-      <w:pPr>
-        <w:keepNext w:val="0"/>
-        <w:spacing w:after="60"/>
-      </w:pPr>
-      <w:r>
-        <w:rPr>
-          <w:rFonts w:eastAsia="微软雅黑"/>
-          <w:b w:val="0"/>
-          <w:sz w:val="18"/>
-        </w:rPr>
-        <w:t>个人主页  lucianwangchn.github.io</w:t>
-      </w:r>
-    </w:p>
-    <w:p>
-      <w:pPr>
-        <w:pStyle w:val="Heading1"/>
-      </w:pPr>
-      <w:r>
-        <w:rPr>
-          <w:rFonts w:eastAsia="微软雅黑"/>
-        </w:rPr>
-        <w:t>教育背景</w:t>
-      </w:r>
-    </w:p>
-    <w:p>
-      <w:pPr>
-        <w:keepNext w:val="0"/>
-        <w:spacing w:after="60"/>
-      </w:pPr>
-      <w:r>
-        <w:rPr>
-          <w:rFonts w:eastAsia="微软雅黑"/>
-          <w:b/>
-        </w:rPr>
-        <w:t>北京理工大学  信息与电子学院  电子信息工程本科                         2025.09—至今</w:t>
-      </w:r>
-    </w:p>
-    <w:p>
-      <w:pPr>
-        <w:keepNext w:val="0"/>
-        <w:spacing w:after="60"/>
-      </w:pPr>
-      <w:r>
-        <w:rPr>
-          <w:rFonts w:eastAsia="微软雅黑"/>
-          <w:b w:val="0"/>
-        </w:rPr>
-        <w:t>大一学年纯成绩排名 2/230  ·  综合测评排名 1/230  ·  大学英语四级 613 分</w:t>
-      </w:r>
-    </w:p>
-    <w:p>
-      <w:pPr>
-        <w:keepNext w:val="0"/>
-        <w:spacing w:after="40"/>
-      </w:pPr>
-      <w:r>
-        <w:rPr>
-          <w:rFonts w:eastAsia="微软雅黑"/>
-          <w:b/>
-          <w:sz w:val="19"/>
-        </w:rPr>
-        <w:t>国家奖学金获得者</w:t>
-      </w:r>
-    </w:p>
-    <w:p>
-      <w:pPr>
-        <w:pStyle w:val="Heading1"/>
-      </w:pPr>
-      <w:r>
-        <w:rPr>
-          <w:rFonts w:eastAsia="微软雅黑"/>
-        </w:rPr>
-        <w:t>研究兴趣</w:t>
-      </w:r>
-    </w:p>
-    <w:p>
-      <w:pPr>
-        <w:keepNext w:val="0"/>
-        <w:spacing w:after="60"/>
-      </w:pPr>
-      <w:r>
-        <w:rPr>
-          <w:rFonts w:eastAsia="微软雅黑"/>
-          <w:b w:val="0"/>
-        </w:rPr>
-        <w:t>具身智能、灵巧操作与机器人学习，重点关注异构运动重定向、可穿戴感知及人类示教。</w:t>
-      </w:r>
-    </w:p>
-    <w:p>
-      <w:pPr>
-        <w:pStyle w:val="Heading1"/>
-      </w:pPr>
-      <w:r>
-        <w:rPr>
-          <w:rFonts w:eastAsia="微软雅黑"/>
-        </w:rPr>
-        <w:t>研究与工程经历</w:t>
-      </w:r>
-    </w:p>
-    <w:p>
-      <w:pPr>
-        <w:keepNext/>
-        <w:spacing w:after="40"/>
-      </w:pPr>
-      <w:r>
-        <w:rPr>
-          <w:rFonts w:eastAsia="微软雅黑"/>
-          <w:b/>
-        </w:rPr>
-        <w:t>灵巧手异构运动重定向  DOGlove × ORCA  |  2026—至今</w:t>
-      </w:r>
-    </w:p>
-    <w:p>
-      <w:pPr>
-        <w:keepNext/>
-        <w:spacing w:after="40"/>
-      </w:pPr>
-      <w:r>
-        <w:rPr>
-          <w:rFonts w:eastAsia="微软雅黑"/>
-          <w:b w:val="0"/>
-        </w:rPr>
-        <w:t>针对构型、指长与零位差异，实现掌坐标下逐指空间映射、平手标定和受关节范围约束的指尖 IK；通过弱姿态偏好分析空间目标与关节姿态的取舍。</w:t>
-      </w:r>
-    </w:p>
-    <w:p>
-      <w:pPr>
-        <w:keepNext w:val="0"/>
-        <w:spacing w:after="80"/>
-      </w:pPr>
-      <w:r>
-        <w:rPr>
-          <w:rFonts w:eastAsia="微软雅黑"/>
-          <w:b w:val="0"/>
-          <w:color w:val="505850"/>
-          <w:sz w:val="18"/>
-        </w:rPr>
-        <w:t>整理 223 条逐指记录与保留测试；离线对照中参考关节 RMSE 由 23.56° 降至 23.20°。</w:t>
-      </w:r>
-    </w:p>
-    <w:p>
-      <w:pPr>
-        <w:keepNext/>
-        <w:spacing w:after="40"/>
-      </w:pPr>
-      <w:r>
-        <w:rPr>
-          <w:rFonts w:eastAsia="微软雅黑"/>
-          <w:b/>
-        </w:rPr>
-        <w:t>SIGNSPEAK 情感反馈手语手套  |  主要研发</w:t>
-      </w:r>
-    </w:p>
-    <w:p>
-      <w:pPr>
-        <w:keepNext/>
-        <w:spacing w:after="40"/>
-      </w:pPr>
-      <w:r>
-        <w:rPr>
-          <w:rFonts w:eastAsia="微软雅黑"/>
-          <w:b w:val="0"/>
-        </w:rPr>
-        <w:t>除三维建模与 PPT 外，基本独立完成硬件、Arduino 固件、BLE 采集和随机森林分类；集成 Wav2Vec2/MLP 与 ASR/LLM 双通道分析及显示、振动反馈。</w:t>
-      </w:r>
-    </w:p>
-    <w:p>
-      <w:pPr>
-        <w:keepNext w:val="0"/>
-        <w:spacing w:after="80"/>
-      </w:pPr>
-      <w:r>
-        <w:rPr>
-          <w:rFonts w:eastAsia="微软雅黑"/>
-          <w:b w:val="0"/>
-          <w:color w:val="505850"/>
-          <w:sz w:val="18"/>
-        </w:rPr>
-        <w:t>形成传感采集—训练—预测流程与实物原型，获未来设计师 NCDA 全国总决赛三等奖，第二作者。</w:t>
-      </w:r>
-    </w:p>
-    <w:p>
-      <w:pPr>
-        <w:keepNext/>
-        <w:spacing w:after="40"/>
-      </w:pPr>
-      <w:r>
-        <w:rPr>
-          <w:rFonts w:eastAsia="微软雅黑"/>
-          <w:b/>
-        </w:rPr>
-        <w:t>星居 AI 端云协同智慧空间  |  项目负责人</w:t>
-      </w:r>
-    </w:p>
-    <w:p>
-      <w:pPr>
-        <w:keepNext/>
-        <w:spacing w:after="40"/>
-      </w:pPr>
-      <w:r>
-        <w:rPr>
-          <w:rFonts w:eastAsia="微软雅黑"/>
-          <w:b w:val="0"/>
-        </w:rPr>
-        <w:t>负责桌面智能体、状态与偏好记忆及决策逻辑，通过华为云 IoTDA 接入实体设备；整合命令解释、动作派发与状态回读，完成系统联调和演示材料。</w:t>
-      </w:r>
-    </w:p>
-    <w:p>
-      <w:pPr>
-        <w:keepNext w:val="0"/>
-        <w:spacing w:after="80"/>
-      </w:pPr>
-      <w:r>
-        <w:rPr>
-          <w:rFonts w:eastAsia="微软雅黑"/>
-          <w:b w:val="0"/>
-          <w:color w:val="505850"/>
-          <w:sz w:val="18"/>
-        </w:rPr>
-        <w:t>获华为 OPC 优秀奖；中国国际大学生创新大赛省赛金奖争夺赛备赛中。</w:t>
-      </w:r>
-    </w:p>
-    <w:p>
-      <w:pPr>
-        <w:keepNext/>
-        <w:spacing w:after="40"/>
-      </w:pPr>
-      <w:r>
-        <w:rPr>
-          <w:rFonts w:eastAsia="微软雅黑"/>
-          <w:b/>
-        </w:rPr>
-        <w:t>机器人与智能车实践  |  屠龙勇士队长 / 校机器人队</w:t>
-      </w:r>
-    </w:p>
-    <w:p>
-      <w:pPr>
-        <w:keepNext/>
-        <w:spacing w:after="40"/>
-      </w:pPr>
-      <w:r>
-        <w:rPr>
-          <w:rFonts w:eastAsia="微软雅黑"/>
-          <w:b w:val="0"/>
-        </w:rPr>
-        <w:t>完成微控制器智能车的硬件装配、传感器与电机接入、固件调试及赛道测试，积累真实机器人平台的软硬件联调经验。</w:t>
-      </w:r>
-    </w:p>
-    <w:p>
-      <w:pPr>
-        <w:keepNext w:val="0"/>
-        <w:spacing w:after="80"/>
-      </w:pPr>
-      <w:r>
-        <w:rPr>
-          <w:rFonts w:eastAsia="微软雅黑"/>
-          <w:b w:val="0"/>
-          <w:color w:val="505850"/>
-          <w:sz w:val="18"/>
-        </w:rPr>
-        <w:t>第十一届屠龙勇士智能车大赛校二等奖；追梦杯机器人竞赛校三等奖。</w:t>
-      </w:r>
-    </w:p>
-    <w:p>
-      <w:pPr>
-        <w:pStyle w:val="Heading1"/>
-      </w:pPr>
-      <w:r>
-        <w:rPr>
-          <w:rFonts w:eastAsia="微软雅黑"/>
-        </w:rPr>
-        <w:t>技术能力</w:t>
-      </w:r>
-    </w:p>
-    <w:p>
-      <w:pPr>
-        <w:keepNext w:val="0"/>
-        <w:spacing w:after="60"/>
-      </w:pPr>
-      <w:r>
-        <w:rPr>
-          <w:rFonts w:eastAsia="微软雅黑"/>
-          <w:b w:val="0"/>
-        </w:rPr>
-        <w:t>项目中使用：Python、C/C++、Arduino、Git、Linux；NumPy、SciPy、scikit-learn、MuJoCo。</w:t>
-      </w:r>
-    </w:p>
-    <w:p>
-      <w:pPr>
-        <w:keepNext w:val="0"/>
-        <w:spacing w:after="60"/>
-      </w:pPr>
-      <w:r>
-        <w:rPr>
-          <w:rFonts w:eastAsia="微软雅黑"/>
-          <w:b w:val="0"/>
-        </w:rPr>
-        <w:t>实践内容：传感数据采集、BLE 通信、正逆运动学、约束优化、模型集成及实验回放。</w:t>
-      </w:r>
-    </w:p>
-    <w:p>
-      <w:pPr>
-        <w:pStyle w:val="Heading1"/>
-      </w:pPr>
-      <w:r>
-        <w:rPr>
-          <w:rFonts w:eastAsia="微软雅黑"/>
-        </w:rPr>
-        <w:t>代表性获奖</w:t>
-      </w:r>
-    </w:p>
-    <w:p>
-      <w:pPr>
-        <w:keepNext w:val="0"/>
-        <w:spacing w:after="40"/>
-      </w:pPr>
-      <w:r>
-        <w:rPr>
-          <w:rFonts w:eastAsia="微软雅黑"/>
-          <w:b w:val="0"/>
-          <w:sz w:val="18"/>
-        </w:rPr>
-        <w:t>光电设计竞赛华北区二等奖；蓝桥杯 C/C++ 大学 A 组、码蹄杯北京赛区三等奖。</w:t>
-      </w:r>
-    </w:p>
-    <w:p>
-      <w:pPr>
-        <w:keepNext w:val="0"/>
-        <w:spacing w:after="0"/>
-      </w:pPr>
-      <w:r>
-        <w:rPr>
-          <w:rFonts w:eastAsia="微软雅黑"/>
-          <w:b w:val="0"/>
-          <w:sz w:val="18"/>
-        </w:rPr>
-        <w:t>博约杯物理竞赛校一等奖；CUPT 校内选拔赛、芯火计划集成电路大赛校二等奖。</w:t>
-      </w:r>
-    </w:p>
+    <w:tbl>
+      <w:tblPr>
+        <w:tblW w:type="auto" w:w="0"/>
+        <w:jc w:val="center"/>
+        <w:tblLayout w:type="fixed"/>
+        <w:tblLook w:firstColumn="1" w:firstRow="1" w:lastColumn="0" w:lastRow="0" w:noHBand="0" w:noVBand="1" w:val="04A0"/>
+        <w:tblBorders>
+          <w:top w:val="nil"/>
+          <w:left w:val="nil"/>
+          <w:bottom w:val="nil"/>
+          <w:right w:val="nil"/>
+          <w:insideH w:val="nil"/>
+          <w:insideV w:val="nil"/>
+        </w:tblBorders>
+      </w:tblPr>
+      <w:tblGrid>
+        <w:gridCol w:w="3175"/>
+        <w:gridCol w:w="7824"/>
+      </w:tblGrid>
+      <w:tr>
+        <w:trPr>
+          <w:cantSplit/>
+        </w:trPr>
+        <w:tc>
+          <w:tcPr>
+            <w:tcW w:type="dxa" w:w="3175"/>
+            <w:vAlign w:val="top"/>
+            <w:tcMar>
+              <w:top w:w="110" w:type="dxa"/>
+              <w:start w:w="125" w:type="dxa"/>
+              <w:bottom w:w="100" w:type="dxa"/>
+              <w:end w:w="125" w:type="dxa"/>
+            </w:tcMar>
+            <w:shd w:fill="3B7391"/>
+          </w:tcPr>
+          <w:p>
+            <w:pPr>
+              <w:keepLines w:val="0"/>
+              <w:spacing w:before="0" w:after="40" w:line="240" w:lineRule="auto"/>
+              <w:jc w:val="center"/>
+            </w:pPr>
+            <w:r>
+              <w:drawing>
+                <wp:inline xmlns:a="http://schemas.openxmlformats.org/drawingml/2006/main" xmlns:pic="http://schemas.openxmlformats.org/drawingml/2006/picture">
+                  <wp:extent cx="1332000" cy="1774800"/>
+                  <wp:docPr id="1" name="Picture 1"/>
+                  <wp:cNvGraphicFramePr>
+                    <a:graphicFrameLocks noChangeAspect="1"/>
+                  </wp:cNvGraphicFramePr>
+                  <a:graphic>
+                    <a:graphicData uri="http://schemas.openxmlformats.org/drawingml/2006/picture">
+                      <pic:pic>
+                        <pic:nvPicPr>
+                          <pic:cNvPr id="0" name="headshot.png"/>
+                          <pic:cNvPicPr/>
+                        </pic:nvPicPr>
+                        <pic:blipFill>
+                          <a:blip r:embed="rId9"/>
+                          <a:stretch>
+                            <a:fillRect/>
+                          </a:stretch>
+                        </pic:blipFill>
+                        <pic:spPr>
+                          <a:xfrm>
+                            <a:off x="0" y="0"/>
+                            <a:ext cx="1332000" cy="1774800"/>
+                          </a:xfrm>
+                          <a:prstGeom prst="rect"/>
+                        </pic:spPr>
+                      </pic:pic>
+                    </a:graphicData>
+                  </a:graphic>
+                </wp:inline>
+              </w:drawing>
+            </w:r>
+          </w:p>
+          <w:p>
+            <w:pPr>
+              <w:keepLines/>
+              <w:spacing w:before="100" w:after="50" w:line="240" w:lineRule="auto"/>
+              <w:pBdr>
+                <w:bottom w:val="single" w:sz="5" w:space="2" w:color="DDEBF2"/>
+              </w:pBdr>
+            </w:pPr>
+            <w:r>
+              <w:rPr>
+                <w:rFonts w:ascii="Calibri" w:hAnsi="Calibri" w:eastAsia="微软雅黑"/>
+                <w:b/>
+                <w:color w:val="DDEBF2"/>
+                <w:sz w:val="18"/>
+              </w:rPr>
+              <w:t>教育背景</w:t>
+            </w:r>
+          </w:p>
+          <w:p>
+            <w:pPr>
+              <w:keepLines/>
+              <w:spacing w:before="0" w:after="20" w:line="259" w:lineRule="auto"/>
+            </w:pPr>
+            <w:r>
+              <w:rPr>
+                <w:rFonts w:ascii="Calibri" w:hAnsi="Calibri" w:eastAsia="微软雅黑"/>
+                <w:b/>
+                <w:color w:val="FFFFFF"/>
+                <w:sz w:val="18"/>
+              </w:rPr>
+              <w:t>北京理工大学</w:t>
+            </w:r>
+          </w:p>
+          <w:p>
+            <w:pPr>
+              <w:keepLines/>
+              <w:spacing w:before="0" w:after="20" w:line="259" w:lineRule="auto"/>
+            </w:pPr>
+            <w:r>
+              <w:rPr>
+                <w:rFonts w:ascii="Calibri" w:hAnsi="Calibri" w:eastAsia="微软雅黑"/>
+                <w:b w:val="0"/>
+                <w:color w:val="FFFFFF"/>
+                <w:sz w:val="15"/>
+              </w:rPr>
+              <w:t>信息与电子学院 · 电子信息工程</w:t>
+            </w:r>
+          </w:p>
+          <w:p>
+            <w:pPr>
+              <w:keepLines/>
+              <w:spacing w:before="0" w:after="24" w:line="259" w:lineRule="auto"/>
+            </w:pPr>
+            <w:r>
+              <w:rPr>
+                <w:rFonts w:ascii="Calibri" w:hAnsi="Calibri" w:eastAsia="微软雅黑"/>
+                <w:b w:val="0"/>
+                <w:color w:val="DDEBF2"/>
+                <w:sz w:val="15"/>
+              </w:rPr>
+              <w:t>本科在读  |  2025.09—至今</w:t>
+            </w:r>
+          </w:p>
+          <w:p>
+            <w:pPr>
+              <w:keepLines/>
+              <w:spacing w:before="0" w:after="20" w:line="259" w:lineRule="auto"/>
+            </w:pPr>
+            <w:r>
+              <w:rPr>
+                <w:rFonts w:ascii="Calibri" w:hAnsi="Calibri" w:eastAsia="微软雅黑"/>
+                <w:b/>
+                <w:color w:val="FFFFFF"/>
+                <w:sz w:val="16"/>
+              </w:rPr>
+              <w:t>学年纯成绩排名  2 / 230</w:t>
+            </w:r>
+          </w:p>
+          <w:p>
+            <w:pPr>
+              <w:keepLines/>
+              <w:spacing w:before="0" w:after="20" w:line="259" w:lineRule="auto"/>
+            </w:pPr>
+            <w:r>
+              <w:rPr>
+                <w:rFonts w:ascii="Calibri" w:hAnsi="Calibri" w:eastAsia="微软雅黑"/>
+                <w:b/>
+                <w:color w:val="FFFFFF"/>
+                <w:sz w:val="16"/>
+              </w:rPr>
+              <w:t>综合测评排名  1 / 230</w:t>
+            </w:r>
+          </w:p>
+          <w:p>
+            <w:pPr>
+              <w:keepLines/>
+              <w:spacing w:before="0" w:after="20" w:line="259" w:lineRule="auto"/>
+            </w:pPr>
+            <w:r>
+              <w:rPr>
+                <w:rFonts w:ascii="Calibri" w:hAnsi="Calibri" w:eastAsia="微软雅黑"/>
+                <w:b w:val="0"/>
+                <w:color w:val="FFFFFF"/>
+                <w:sz w:val="16"/>
+              </w:rPr>
+              <w:t>CET-4  613</w:t>
+            </w:r>
+          </w:p>
+          <w:p>
+            <w:pPr>
+              <w:keepLines/>
+              <w:spacing w:before="100" w:after="50" w:line="240" w:lineRule="auto"/>
+              <w:pBdr>
+                <w:bottom w:val="single" w:sz="5" w:space="2" w:color="DDEBF2"/>
+              </w:pBdr>
+            </w:pPr>
+            <w:r>
+              <w:rPr>
+                <w:rFonts w:ascii="Calibri" w:hAnsi="Calibri" w:eastAsia="微软雅黑"/>
+                <w:b/>
+                <w:color w:val="DDEBF2"/>
+                <w:sz w:val="18"/>
+              </w:rPr>
+              <w:t>研究兴趣</w:t>
+            </w:r>
+          </w:p>
+          <w:p>
+            <w:pPr>
+              <w:keepLines/>
+              <w:spacing w:before="0" w:after="20" w:line="259" w:lineRule="auto"/>
+            </w:pPr>
+            <w:r>
+              <w:rPr>
+                <w:rFonts w:ascii="Calibri" w:hAnsi="Calibri" w:eastAsia="微软雅黑"/>
+                <w:b/>
+                <w:color w:val="FFFFFF"/>
+                <w:sz w:val="16"/>
+              </w:rPr>
+              <w:t>具身智能 · 灵巧操作</w:t>
+            </w:r>
+          </w:p>
+          <w:p>
+            <w:pPr>
+              <w:keepLines/>
+              <w:spacing w:before="0" w:after="20" w:line="259" w:lineRule="auto"/>
+            </w:pPr>
+            <w:r>
+              <w:rPr>
+                <w:rFonts w:ascii="Calibri" w:hAnsi="Calibri" w:eastAsia="微软雅黑"/>
+                <w:b w:val="0"/>
+                <w:color w:val="FFFFFF"/>
+                <w:sz w:val="15"/>
+              </w:rPr>
+              <w:t>机器人运动重定向与学习</w:t>
+            </w:r>
+          </w:p>
+          <w:p>
+            <w:pPr>
+              <w:keepLines/>
+              <w:spacing w:before="0" w:after="20" w:line="259" w:lineRule="auto"/>
+            </w:pPr>
+            <w:r>
+              <w:rPr>
+                <w:rFonts w:ascii="Calibri" w:hAnsi="Calibri" w:eastAsia="微软雅黑"/>
+                <w:b w:val="0"/>
+                <w:color w:val="FFFFFF"/>
+                <w:sz w:val="15"/>
+              </w:rPr>
+              <w:t>可穿戴感知与人机交互</w:t>
+            </w:r>
+          </w:p>
+          <w:p>
+            <w:pPr>
+              <w:keepLines/>
+              <w:spacing w:before="100" w:after="50" w:line="240" w:lineRule="auto"/>
+              <w:pBdr>
+                <w:bottom w:val="single" w:sz="5" w:space="2" w:color="DDEBF2"/>
+              </w:pBdr>
+            </w:pPr>
+            <w:r>
+              <w:rPr>
+                <w:rFonts w:ascii="Calibri" w:hAnsi="Calibri" w:eastAsia="微软雅黑"/>
+                <w:b/>
+                <w:color w:val="DDEBF2"/>
+                <w:sz w:val="18"/>
+              </w:rPr>
+              <w:t>技术能力</w:t>
+            </w:r>
+          </w:p>
+          <w:p>
+            <w:pPr>
+              <w:keepLines/>
+              <w:spacing w:before="0" w:after="24" w:line="259" w:lineRule="auto"/>
+            </w:pPr>
+            <w:r>
+              <w:rPr>
+                <w:rFonts w:ascii="Calibri" w:hAnsi="Calibri" w:eastAsia="微软雅黑"/>
+                <w:b w:val="0"/>
+                <w:color w:val="FFFFFF"/>
+                <w:sz w:val="15"/>
+              </w:rPr>
+              <w:t>编程  Python · C/C++ · Arduino</w:t>
+            </w:r>
+          </w:p>
+          <w:p>
+            <w:pPr>
+              <w:keepLines/>
+              <w:spacing w:before="0" w:after="24" w:line="259" w:lineRule="auto"/>
+            </w:pPr>
+            <w:r>
+              <w:rPr>
+                <w:rFonts w:ascii="Calibri" w:hAnsi="Calibri" w:eastAsia="微软雅黑"/>
+                <w:b w:val="0"/>
+                <w:color w:val="FFFFFF"/>
+                <w:sz w:val="15"/>
+              </w:rPr>
+              <w:t>计算  NumPy · SciPy · scikit-learn</w:t>
+            </w:r>
+          </w:p>
+          <w:p>
+            <w:pPr>
+              <w:keepLines/>
+              <w:spacing w:before="0" w:after="24" w:line="259" w:lineRule="auto"/>
+            </w:pPr>
+            <w:r>
+              <w:rPr>
+                <w:rFonts w:ascii="Calibri" w:hAnsi="Calibri" w:eastAsia="微软雅黑"/>
+                <w:b w:val="0"/>
+                <w:color w:val="FFFFFF"/>
+                <w:sz w:val="15"/>
+              </w:rPr>
+              <w:t>机器人  正逆运动学 · 约束优化</w:t>
+            </w:r>
+          </w:p>
+          <w:p>
+            <w:pPr>
+              <w:keepLines/>
+              <w:spacing w:before="0" w:after="24" w:line="259" w:lineRule="auto"/>
+            </w:pPr>
+            <w:r>
+              <w:rPr>
+                <w:rFonts w:ascii="Calibri" w:hAnsi="Calibri" w:eastAsia="微软雅黑"/>
+                <w:b w:val="0"/>
+                <w:color w:val="FFFFFF"/>
+                <w:sz w:val="15"/>
+              </w:rPr>
+              <w:t>系统  BLE · Git · Linux · MuJoCo</w:t>
+            </w:r>
+          </w:p>
+          <w:p>
+            <w:pPr>
+              <w:keepLines/>
+              <w:spacing w:before="100" w:after="50" w:line="240" w:lineRule="auto"/>
+              <w:pBdr>
+                <w:bottom w:val="single" w:sz="5" w:space="2" w:color="DDEBF2"/>
+              </w:pBdr>
+            </w:pPr>
+            <w:r>
+              <w:rPr>
+                <w:rFonts w:ascii="Calibri" w:hAnsi="Calibri" w:eastAsia="微软雅黑"/>
+                <w:b/>
+                <w:color w:val="DDEBF2"/>
+                <w:sz w:val="18"/>
+              </w:rPr>
+              <w:t>联系与作品</w:t>
+            </w:r>
+          </w:p>
+          <w:p>
+            <w:pPr>
+              <w:keepLines/>
+              <w:spacing w:before="0" w:after="28" w:line="259" w:lineRule="auto"/>
+            </w:pPr>
+            <w:r>
+              <w:rPr>
+                <w:rFonts w:ascii="Calibri" w:hAnsi="Calibri" w:eastAsia="微软雅黑"/>
+                <w:b w:val="0"/>
+                <w:color w:val="FFFFFF"/>
+                <w:sz w:val="14"/>
+              </w:rPr>
+              <w:t>chenxuwang.chn@outlook.com</w:t>
+            </w:r>
+          </w:p>
+          <w:p>
+            <w:pPr>
+              <w:keepLines/>
+              <w:spacing w:before="0" w:after="28" w:line="259" w:lineRule="auto"/>
+            </w:pPr>
+            <w:r>
+              <w:rPr>
+                <w:rFonts w:ascii="Calibri" w:hAnsi="Calibri" w:eastAsia="微软雅黑"/>
+                <w:b w:val="0"/>
+                <w:color w:val="FFFFFF"/>
+                <w:sz w:val="15"/>
+              </w:rPr>
+              <w:t>lucianwangchn.github.io</w:t>
+            </w:r>
+          </w:p>
+          <w:p>
+            <w:pPr>
+              <w:keepLines/>
+              <w:spacing w:before="0" w:after="8" w:line="259" w:lineRule="auto"/>
+            </w:pPr>
+            <w:r>
+              <w:rPr>
+                <w:rFonts w:ascii="Calibri" w:hAnsi="Calibri" w:eastAsia="微软雅黑"/>
+                <w:b w:val="0"/>
+                <w:color w:val="DDEBF2"/>
+                <w:sz w:val="14"/>
+              </w:rPr>
+              <w:t>github.com/LucianWangChn</w:t>
+            </w:r>
+          </w:p>
+        </w:tc>
+        <w:tc>
+          <w:tcPr>
+            <w:tcW w:type="dxa" w:w="7824"/>
+            <w:vAlign w:val="top"/>
+            <w:tcMar>
+              <w:top w:w="70" w:type="dxa"/>
+              <w:start w:w="210" w:type="dxa"/>
+              <w:bottom w:w="70" w:type="dxa"/>
+              <w:end w:w="90" w:type="dxa"/>
+            </w:tcMar>
+          </w:tcPr>
+          <w:p>
+            <w:pPr>
+              <w:keepLines/>
+              <w:spacing w:before="20" w:after="10" w:line="240" w:lineRule="auto"/>
+            </w:pPr>
+            <w:r>
+              <w:rPr>
+                <w:rFonts w:ascii="Calibri" w:hAnsi="Calibri" w:eastAsia="微软雅黑"/>
+                <w:b/>
+                <w:color w:val="173B52"/>
+                <w:sz w:val="46"/>
+              </w:rPr>
+              <w:t>王晨旭</w:t>
+            </w:r>
+            <w:r>
+              <w:rPr>
+                <w:rFonts w:ascii="Calibri" w:hAnsi="Calibri" w:eastAsia="Calibri"/>
+                <w:b w:val="0"/>
+                <w:color w:val="5B6870"/>
+                <w:sz w:val="18"/>
+              </w:rPr>
+              <w:t xml:space="preserve">  CHENXU WANG</w:t>
+            </w:r>
+          </w:p>
+          <w:p>
+            <w:pPr>
+              <w:keepLines/>
+              <w:spacing w:before="0" w:after="46" w:line="240" w:lineRule="auto"/>
+            </w:pPr>
+            <w:r>
+              <w:rPr>
+                <w:rFonts w:ascii="Calibri" w:hAnsi="Calibri" w:eastAsia="微软雅黑"/>
+                <w:b/>
+                <w:color w:val="3B7391"/>
+                <w:sz w:val="18"/>
+              </w:rPr>
+              <w:t>北京理工大学 · 电子信息工程本科生</w:t>
+            </w:r>
+          </w:p>
+          <w:p>
+            <w:pPr>
+              <w:keepLines/>
+              <w:spacing w:before="0" w:after="60" w:line="259" w:lineRule="auto"/>
+            </w:pPr>
+            <w:r>
+              <w:rPr>
+                <w:rFonts w:ascii="Calibri" w:hAnsi="Calibri" w:eastAsia="微软雅黑"/>
+                <w:b w:val="0"/>
+                <w:color w:val="202B31"/>
+                <w:sz w:val="17"/>
+              </w:rPr>
+              <w:t>关注具身智能、灵巧操作与机器人学习，围绕异构手部运动映射和可穿戴感知开展运动学建模、传感采集与软硬件集成；注重量化评估、误差分析与实物联调。</w:t>
+            </w:r>
+          </w:p>
+          <w:p>
+            <w:pPr>
+              <w:keepLines/>
+              <w:spacing w:before="84" w:after="56" w:line="240" w:lineRule="auto"/>
+              <w:pBdr>
+                <w:bottom w:val="single" w:sz="8" w:space="2" w:color="78A6BC"/>
+              </w:pBdr>
+            </w:pPr>
+            <w:r>
+              <w:rPr>
+                <w:rFonts w:ascii="Calibri" w:hAnsi="Calibri" w:eastAsia="微软雅黑"/>
+                <w:b/>
+                <w:color w:val="173B52"/>
+                <w:sz w:val="20"/>
+              </w:rPr>
+              <w:t>研究与项目经历</w:t>
+            </w:r>
+          </w:p>
+          <w:tbl>
+            <w:tblPr>
+              <w:tblW w:type="auto" w:w="0"/>
+              <w:jc w:val="left"/>
+              <w:tblLayout w:type="fixed"/>
+              <w:tblLook w:firstColumn="1" w:firstRow="1" w:lastColumn="0" w:lastRow="0" w:noHBand="0" w:noVBand="1" w:val="04A0"/>
+              <w:tblBorders>
+                <w:top w:val="nil"/>
+                <w:left w:val="nil"/>
+                <w:bottom w:val="nil"/>
+                <w:right w:val="nil"/>
+                <w:insideH w:val="nil"/>
+                <w:insideV w:val="nil"/>
+              </w:tblBorders>
+            </w:tblPr>
+            <w:tblGrid>
+              <w:gridCol w:w="5953"/>
+              <w:gridCol w:w="1644"/>
+            </w:tblGrid>
+            <w:tr>
+              <w:tc>
+                <w:tcPr>
+                  <w:tcW w:type="dxa" w:w="5953"/>
+                  <w:tcMar>
+                    <w:top w:w="0" w:type="dxa"/>
+                    <w:start w:w="0" w:type="dxa"/>
+                    <w:bottom w:w="0" w:type="dxa"/>
+                    <w:end w:w="0" w:type="dxa"/>
+                  </w:tcMar>
+                  <w:vAlign w:val="center"/>
+                </w:tcPr>
+                <w:p>
+                  <w:pPr>
+                    <w:keepLines/>
+                    <w:spacing w:before="0" w:after="8" w:line="240" w:lineRule="auto"/>
+                  </w:pPr>
+                  <w:r>
+                    <w:rPr>
+                      <w:rFonts w:ascii="Calibri" w:hAnsi="Calibri" w:eastAsia="微软雅黑"/>
+                      <w:b/>
+                      <w:color w:val="202B31"/>
+                      <w:sz w:val="18"/>
+                    </w:rPr>
+                    <w:t>灵巧手异构运动重定向  DOGlove × ORCA</w:t>
+                  </w:r>
+                  <w:r>
+                    <w:rPr>
+                      <w:rFonts w:ascii="Calibri" w:hAnsi="Calibri" w:eastAsia="微软雅黑"/>
+                      <w:b w:val="0"/>
+                      <w:color w:val="3B7391"/>
+                      <w:sz w:val="15"/>
+                    </w:rPr>
+                    <w:t xml:space="preserve">  |  运动学建模与算法实践</w:t>
+                  </w:r>
+                </w:p>
+              </w:tc>
+              <w:tc>
+                <w:tcPr>
+                  <w:tcW w:type="dxa" w:w="1644"/>
+                  <w:tcMar>
+                    <w:top w:w="0" w:type="dxa"/>
+                    <w:start w:w="0" w:type="dxa"/>
+                    <w:bottom w:w="0" w:type="dxa"/>
+                    <w:end w:w="0" w:type="dxa"/>
+                  </w:tcMar>
+                  <w:vAlign w:val="center"/>
+                </w:tcPr>
+                <w:p>
+                  <w:pPr>
+                    <w:keepLines/>
+                    <w:spacing w:before="0" w:after="8" w:line="240" w:lineRule="auto"/>
+                    <w:jc w:val="right"/>
+                  </w:pPr>
+                  <w:r>
+                    <w:rPr>
+                      <w:rFonts w:ascii="Calibri" w:hAnsi="Calibri" w:eastAsia="微软雅黑"/>
+                      <w:b w:val="0"/>
+                      <w:color w:val="5B6870"/>
+                      <w:sz w:val="15"/>
+                    </w:rPr>
+                    <w:t>2026—至今</w:t>
+                  </w:r>
+                </w:p>
+              </w:tc>
+            </w:tr>
+          </w:tbl>
+          <w:p/>
+          <w:p>
+            <w:pPr>
+              <w:keepLines/>
+              <w:spacing w:before="0" w:after="20" w:line="264" w:lineRule="auto"/>
+            </w:pPr>
+            <w:r>
+              <w:rPr>
+                <w:rFonts w:ascii="Calibri" w:hAnsi="Calibri" w:eastAsia="微软雅黑"/>
+                <w:b w:val="0"/>
+                <w:color w:val="202B31"/>
+                <w:sz w:val="17"/>
+              </w:rPr>
+              <w:t>方法与贡献｜针对佩戴零位和手部构型差异，建立平手标定与逐指掌坐标映射；采用受关节范围约束的指尖逆运动学，并在零空间中加入弱姿态偏好。</w:t>
+            </w:r>
+          </w:p>
+          <w:p>
+            <w:pPr>
+              <w:keepLines/>
+              <w:spacing w:before="0" w:after="80" w:line="264" w:lineRule="auto"/>
+            </w:pPr>
+            <w:r>
+              <w:rPr>
+                <w:rFonts w:ascii="Calibri" w:hAnsi="Calibri" w:eastAsia="微软雅黑"/>
+                <w:b w:val="0"/>
+                <w:color w:val="5B6870"/>
+                <w:sz w:val="17"/>
+              </w:rPr>
+              <w:t>成果｜整理 223 条姿态记录并开展离线保留测试，参考关节 RMSE 由 23.56° 降至 23.20°。</w:t>
+            </w:r>
+          </w:p>
+          <w:tbl>
+            <w:tblPr>
+              <w:tblW w:type="auto" w:w="0"/>
+              <w:jc w:val="left"/>
+              <w:tblLayout w:type="fixed"/>
+              <w:tblLook w:firstColumn="1" w:firstRow="1" w:lastColumn="0" w:lastRow="0" w:noHBand="0" w:noVBand="1" w:val="04A0"/>
+              <w:tblBorders>
+                <w:top w:val="nil"/>
+                <w:left w:val="nil"/>
+                <w:bottom w:val="nil"/>
+                <w:right w:val="nil"/>
+                <w:insideH w:val="nil"/>
+                <w:insideV w:val="nil"/>
+              </w:tblBorders>
+            </w:tblPr>
+            <w:tblGrid>
+              <w:gridCol w:w="5953"/>
+              <w:gridCol w:w="1644"/>
+            </w:tblGrid>
+            <w:tr>
+              <w:tc>
+                <w:tcPr>
+                  <w:tcW w:type="dxa" w:w="5953"/>
+                  <w:tcMar>
+                    <w:top w:w="0" w:type="dxa"/>
+                    <w:start w:w="0" w:type="dxa"/>
+                    <w:bottom w:w="0" w:type="dxa"/>
+                    <w:end w:w="0" w:type="dxa"/>
+                  </w:tcMar>
+                  <w:vAlign w:val="center"/>
+                </w:tcPr>
+                <w:p>
+                  <w:pPr>
+                    <w:keepLines/>
+                    <w:spacing w:before="0" w:after="8" w:line="240" w:lineRule="auto"/>
+                  </w:pPr>
+                  <w:r>
+                    <w:rPr>
+                      <w:rFonts w:ascii="Calibri" w:hAnsi="Calibri" w:eastAsia="微软雅黑"/>
+                      <w:b/>
+                      <w:color w:val="202B31"/>
+                      <w:sz w:val="18"/>
+                    </w:rPr>
+                    <w:t>SIGNSPEAK 多模态情感转译手语手套</w:t>
+                  </w:r>
+                  <w:r>
+                    <w:rPr>
+                      <w:rFonts w:ascii="Calibri" w:hAnsi="Calibri" w:eastAsia="微软雅黑"/>
+                      <w:b w:val="0"/>
+                      <w:color w:val="3B7391"/>
+                      <w:sz w:val="15"/>
+                    </w:rPr>
+                    <w:t xml:space="preserve">  |  主要研发</w:t>
+                  </w:r>
+                </w:p>
+              </w:tc>
+              <w:tc>
+                <w:tcPr>
+                  <w:tcW w:type="dxa" w:w="1644"/>
+                  <w:tcMar>
+                    <w:top w:w="0" w:type="dxa"/>
+                    <w:start w:w="0" w:type="dxa"/>
+                    <w:bottom w:w="0" w:type="dxa"/>
+                    <w:end w:w="0" w:type="dxa"/>
+                  </w:tcMar>
+                  <w:vAlign w:val="center"/>
+                </w:tcPr>
+                <w:p>
+                  <w:pPr>
+                    <w:keepLines/>
+                    <w:spacing w:before="0" w:after="8" w:line="240" w:lineRule="auto"/>
+                    <w:jc w:val="right"/>
+                  </w:pPr>
+                  <w:r>
+                    <w:rPr>
+                      <w:rFonts w:ascii="Calibri" w:hAnsi="Calibri" w:eastAsia="微软雅黑"/>
+                      <w:b w:val="0"/>
+                      <w:color w:val="5B6870"/>
+                      <w:sz w:val="15"/>
+                    </w:rPr>
+                  </w:r>
+                </w:p>
+              </w:tc>
+            </w:tr>
+          </w:tbl>
+          <w:p/>
+          <w:p>
+            <w:pPr>
+              <w:keepLines/>
+              <w:spacing w:before="0" w:after="20" w:line="264" w:lineRule="auto"/>
+            </w:pPr>
+            <w:r>
+              <w:rPr>
+                <w:rFonts w:ascii="Calibri" w:hAnsi="Calibri" w:eastAsia="微软雅黑"/>
+                <w:b w:val="0"/>
+                <w:color w:val="202B31"/>
+                <w:sz w:val="17"/>
+              </w:rPr>
+              <w:t>方法与贡献｜除三维建模与 PPT 外，基本独立完成方案、硬件、Arduino 固件和 Python 程序；实现 BLE 传感采集与随机森林手势识别，集成 Wav2Vec2 声学分析、ASR/LLM 语义分析及显示和振动反馈。</w:t>
+            </w:r>
+          </w:p>
+          <w:p>
+            <w:pPr>
+              <w:keepLines/>
+              <w:spacing w:before="0" w:after="80" w:line="264" w:lineRule="auto"/>
+            </w:pPr>
+            <w:r>
+              <w:rPr>
+                <w:rFonts w:ascii="Calibri" w:hAnsi="Calibri" w:eastAsia="微软雅黑"/>
+                <w:b w:val="0"/>
+                <w:color w:val="5B6870"/>
+                <w:sz w:val="17"/>
+              </w:rPr>
+              <w:t>成果｜完成可穿戴原型及手势采集—训练—预测流程，集成声学、语义和触觉反馈。</w:t>
+            </w:r>
+          </w:p>
+          <w:tbl>
+            <w:tblPr>
+              <w:tblW w:type="auto" w:w="0"/>
+              <w:jc w:val="left"/>
+              <w:tblLayout w:type="fixed"/>
+              <w:tblLook w:firstColumn="1" w:firstRow="1" w:lastColumn="0" w:lastRow="0" w:noHBand="0" w:noVBand="1" w:val="04A0"/>
+              <w:tblBorders>
+                <w:top w:val="nil"/>
+                <w:left w:val="nil"/>
+                <w:bottom w:val="nil"/>
+                <w:right w:val="nil"/>
+                <w:insideH w:val="nil"/>
+                <w:insideV w:val="nil"/>
+              </w:tblBorders>
+            </w:tblPr>
+            <w:tblGrid>
+              <w:gridCol w:w="5953"/>
+              <w:gridCol w:w="1644"/>
+            </w:tblGrid>
+            <w:tr>
+              <w:tc>
+                <w:tcPr>
+                  <w:tcW w:type="dxa" w:w="5953"/>
+                  <w:tcMar>
+                    <w:top w:w="0" w:type="dxa"/>
+                    <w:start w:w="0" w:type="dxa"/>
+                    <w:bottom w:w="0" w:type="dxa"/>
+                    <w:end w:w="0" w:type="dxa"/>
+                  </w:tcMar>
+                  <w:vAlign w:val="center"/>
+                </w:tcPr>
+                <w:p>
+                  <w:pPr>
+                    <w:keepLines/>
+                    <w:spacing w:before="0" w:after="8" w:line="240" w:lineRule="auto"/>
+                  </w:pPr>
+                  <w:r>
+                    <w:rPr>
+                      <w:rFonts w:ascii="Calibri" w:hAnsi="Calibri" w:eastAsia="微软雅黑"/>
+                      <w:b/>
+                      <w:color w:val="202B31"/>
+                      <w:sz w:val="18"/>
+                    </w:rPr>
+                    <w:t>星居 AI 端云协同智慧空间</w:t>
+                  </w:r>
+                  <w:r>
+                    <w:rPr>
+                      <w:rFonts w:ascii="Calibri" w:hAnsi="Calibri" w:eastAsia="微软雅黑"/>
+                      <w:b w:val="0"/>
+                      <w:color w:val="3B7391"/>
+                      <w:sz w:val="15"/>
+                    </w:rPr>
+                    <w:t xml:space="preserve">  |  项目负责人</w:t>
+                  </w:r>
+                </w:p>
+              </w:tc>
+              <w:tc>
+                <w:tcPr>
+                  <w:tcW w:type="dxa" w:w="1644"/>
+                  <w:tcMar>
+                    <w:top w:w="0" w:type="dxa"/>
+                    <w:start w:w="0" w:type="dxa"/>
+                    <w:bottom w:w="0" w:type="dxa"/>
+                    <w:end w:w="0" w:type="dxa"/>
+                  </w:tcMar>
+                  <w:vAlign w:val="center"/>
+                </w:tcPr>
+                <w:p>
+                  <w:pPr>
+                    <w:keepLines/>
+                    <w:spacing w:before="0" w:after="8" w:line="240" w:lineRule="auto"/>
+                    <w:jc w:val="right"/>
+                  </w:pPr>
+                  <w:r>
+                    <w:rPr>
+                      <w:rFonts w:ascii="Calibri" w:hAnsi="Calibri" w:eastAsia="微软雅黑"/>
+                      <w:b w:val="0"/>
+                      <w:color w:val="5B6870"/>
+                      <w:sz w:val="15"/>
+                    </w:rPr>
+                  </w:r>
+                </w:p>
+              </w:tc>
+            </w:tr>
+          </w:tbl>
+          <w:p/>
+          <w:p>
+            <w:pPr>
+              <w:keepLines/>
+              <w:spacing w:before="0" w:after="20" w:line="264" w:lineRule="auto"/>
+            </w:pPr>
+            <w:r>
+              <w:rPr>
+                <w:rFonts w:ascii="Calibri" w:hAnsi="Calibri" w:eastAsia="微软雅黑"/>
+                <w:b w:val="0"/>
+                <w:color w:val="202B31"/>
+                <w:sz w:val="17"/>
+              </w:rPr>
+              <w:t>方法与贡献｜负责桌面智能体、状态与偏好记忆及决策逻辑；连接华为云 IoTDA 与实体设备，整合命令解释、动作派发和状态回读，推进端云系统联调。</w:t>
+            </w:r>
+          </w:p>
+          <w:p>
+            <w:pPr>
+              <w:keepLines/>
+              <w:spacing w:before="0" w:after="80" w:line="264" w:lineRule="auto"/>
+            </w:pPr>
+            <w:r>
+              <w:rPr>
+                <w:rFonts w:ascii="Calibri" w:hAnsi="Calibri" w:eastAsia="微软雅黑"/>
+                <w:b w:val="0"/>
+                <w:color w:val="5B6870"/>
+                <w:sz w:val="17"/>
+              </w:rPr>
+              <w:t>成果｜完成端云设备联调与演示；当前正备战国创赛省赛金奖争夺赛。</w:t>
+            </w:r>
+          </w:p>
+          <w:tbl>
+            <w:tblPr>
+              <w:tblW w:type="auto" w:w="0"/>
+              <w:jc w:val="left"/>
+              <w:tblLayout w:type="fixed"/>
+              <w:tblLook w:firstColumn="1" w:firstRow="1" w:lastColumn="0" w:lastRow="0" w:noHBand="0" w:noVBand="1" w:val="04A0"/>
+              <w:tblBorders>
+                <w:top w:val="nil"/>
+                <w:left w:val="nil"/>
+                <w:bottom w:val="nil"/>
+                <w:right w:val="nil"/>
+                <w:insideH w:val="nil"/>
+                <w:insideV w:val="nil"/>
+              </w:tblBorders>
+            </w:tblPr>
+            <w:tblGrid>
+              <w:gridCol w:w="5953"/>
+              <w:gridCol w:w="1644"/>
+            </w:tblGrid>
+            <w:tr>
+              <w:tc>
+                <w:tcPr>
+                  <w:tcW w:type="dxa" w:w="5953"/>
+                  <w:tcMar>
+                    <w:top w:w="0" w:type="dxa"/>
+                    <w:start w:w="0" w:type="dxa"/>
+                    <w:bottom w:w="0" w:type="dxa"/>
+                    <w:end w:w="0" w:type="dxa"/>
+                  </w:tcMar>
+                  <w:vAlign w:val="center"/>
+                </w:tcPr>
+                <w:p>
+                  <w:pPr>
+                    <w:keepLines/>
+                    <w:spacing w:before="0" w:after="8" w:line="240" w:lineRule="auto"/>
+                  </w:pPr>
+                  <w:r>
+                    <w:rPr>
+                      <w:rFonts w:ascii="Calibri" w:hAnsi="Calibri" w:eastAsia="微软雅黑"/>
+                      <w:b/>
+                      <w:color w:val="202B31"/>
+                      <w:sz w:val="18"/>
+                    </w:rPr>
+                    <w:t>机器人与智能车工程实践</w:t>
+                  </w:r>
+                  <w:r>
+                    <w:rPr>
+                      <w:rFonts w:ascii="Calibri" w:hAnsi="Calibri" w:eastAsia="微软雅黑"/>
+                      <w:b w:val="0"/>
+                      <w:color w:val="3B7391"/>
+                      <w:sz w:val="15"/>
+                    </w:rPr>
+                    <w:t xml:space="preserve">  |  屠龙队长 · 校机器人队</w:t>
+                  </w:r>
+                </w:p>
+              </w:tc>
+              <w:tc>
+                <w:tcPr>
+                  <w:tcW w:type="dxa" w:w="1644"/>
+                  <w:tcMar>
+                    <w:top w:w="0" w:type="dxa"/>
+                    <w:start w:w="0" w:type="dxa"/>
+                    <w:bottom w:w="0" w:type="dxa"/>
+                    <w:end w:w="0" w:type="dxa"/>
+                  </w:tcMar>
+                  <w:vAlign w:val="center"/>
+                </w:tcPr>
+                <w:p>
+                  <w:pPr>
+                    <w:keepLines/>
+                    <w:spacing w:before="0" w:after="8" w:line="240" w:lineRule="auto"/>
+                    <w:jc w:val="right"/>
+                  </w:pPr>
+                  <w:r>
+                    <w:rPr>
+                      <w:rFonts w:ascii="Calibri" w:hAnsi="Calibri" w:eastAsia="微软雅黑"/>
+                      <w:b w:val="0"/>
+                      <w:color w:val="5B6870"/>
+                      <w:sz w:val="15"/>
+                    </w:rPr>
+                    <w:t>2025—2026</w:t>
+                  </w:r>
+                </w:p>
+              </w:tc>
+            </w:tr>
+          </w:tbl>
+          <w:p/>
+          <w:p>
+            <w:pPr>
+              <w:keepLines/>
+              <w:spacing w:before="0" w:after="20" w:line="264" w:lineRule="auto"/>
+            </w:pPr>
+            <w:r>
+              <w:rPr>
+                <w:rFonts w:ascii="Calibri" w:hAnsi="Calibri" w:eastAsia="微软雅黑"/>
+                <w:b w:val="0"/>
+                <w:color w:val="202B31"/>
+                <w:sz w:val="17"/>
+              </w:rPr>
+              <w:t>方法与贡献｜担任屠龙队队长，参与底盘与传感器搭建、电机接入、嵌入式固件调试及赛道测试，组织多轮软硬件联调。</w:t>
+            </w:r>
+          </w:p>
+          <w:p>
+            <w:pPr>
+              <w:keepLines/>
+              <w:spacing w:before="0" w:after="80" w:line="264" w:lineRule="auto"/>
+            </w:pPr>
+            <w:r>
+              <w:rPr>
+                <w:rFonts w:ascii="Calibri" w:hAnsi="Calibri" w:eastAsia="微软雅黑"/>
+                <w:b w:val="0"/>
+                <w:color w:val="5B6870"/>
+                <w:sz w:val="17"/>
+              </w:rPr>
+              <w:t>成果｜完成不同机器人平台的搭建、调试与赛道验证，积累软硬件协同经验。</w:t>
+            </w:r>
+          </w:p>
+          <w:p>
+            <w:pPr>
+              <w:keepLines/>
+              <w:spacing w:before="84" w:after="56" w:line="240" w:lineRule="auto"/>
+              <w:pBdr>
+                <w:bottom w:val="single" w:sz="8" w:space="2" w:color="78A6BC"/>
+              </w:pBdr>
+            </w:pPr>
+            <w:r>
+              <w:rPr>
+                <w:rFonts w:ascii="Calibri" w:hAnsi="Calibri" w:eastAsia="微软雅黑"/>
+                <w:b/>
+                <w:color w:val="173B52"/>
+                <w:sz w:val="20"/>
+              </w:rPr>
+              <w:t>竞赛获奖与荣誉</w:t>
+            </w:r>
+          </w:p>
+          <w:p>
+            <w:pPr>
+              <w:keepLines/>
+              <w:spacing w:before="0" w:after="24" w:line="250" w:lineRule="auto"/>
+            </w:pPr>
+            <w:r>
+              <w:rPr>
+                <w:rFonts w:ascii="Calibri" w:hAnsi="Calibri" w:eastAsia="微软雅黑"/>
+                <w:b w:val="0"/>
+                <w:color w:val="202B31"/>
+                <w:sz w:val="16"/>
+              </w:rPr>
+              <w:t>•  国家奖学金</w:t>
+            </w:r>
+          </w:p>
+          <w:p>
+            <w:pPr>
+              <w:keepLines/>
+              <w:spacing w:before="0" w:after="24" w:line="250" w:lineRule="auto"/>
+            </w:pPr>
+            <w:r>
+              <w:rPr>
+                <w:rFonts w:ascii="Calibri" w:hAnsi="Calibri" w:eastAsia="微软雅黑"/>
+                <w:b w:val="0"/>
+                <w:color w:val="202B31"/>
+                <w:sz w:val="16"/>
+              </w:rPr>
+              <w:t>•  第十四届未来设计师 NCDA 全国总决赛三等奖（第二作者）</w:t>
+            </w:r>
+          </w:p>
+          <w:p>
+            <w:pPr>
+              <w:keepLines/>
+              <w:spacing w:before="0" w:after="24" w:line="250" w:lineRule="auto"/>
+            </w:pPr>
+            <w:r>
+              <w:rPr>
+                <w:rFonts w:ascii="Calibri" w:hAnsi="Calibri" w:eastAsia="微软雅黑"/>
+                <w:b w:val="0"/>
+                <w:color w:val="202B31"/>
+                <w:sz w:val="16"/>
+              </w:rPr>
+              <w:t>•  华为 OPC 大赛优秀奖（星居项目负责人）</w:t>
+            </w:r>
+          </w:p>
+          <w:p>
+            <w:pPr>
+              <w:keepLines/>
+              <w:spacing w:before="0" w:after="24" w:line="250" w:lineRule="auto"/>
+            </w:pPr>
+            <w:r>
+              <w:rPr>
+                <w:rFonts w:ascii="Calibri" w:hAnsi="Calibri" w:eastAsia="微软雅黑"/>
+                <w:b w:val="0"/>
+                <w:color w:val="202B31"/>
+                <w:sz w:val="16"/>
+              </w:rPr>
+              <w:t>•  全国大学生光电设计竞赛华北区二等奖（第二作者）</w:t>
+            </w:r>
+          </w:p>
+          <w:p>
+            <w:pPr>
+              <w:keepLines/>
+              <w:spacing w:before="0" w:after="24" w:line="250" w:lineRule="auto"/>
+            </w:pPr>
+            <w:r>
+              <w:rPr>
+                <w:rFonts w:ascii="Calibri" w:hAnsi="Calibri" w:eastAsia="微软雅黑"/>
+                <w:b w:val="0"/>
+                <w:color w:val="202B31"/>
+                <w:sz w:val="16"/>
+              </w:rPr>
+              <w:t>•  “青创北京·挑战杯”首都大学生创业计划竞赛三等奖（团队成员）</w:t>
+            </w:r>
+          </w:p>
+          <w:p>
+            <w:pPr>
+              <w:keepLines/>
+              <w:spacing w:before="0" w:after="24" w:line="250" w:lineRule="auto"/>
+            </w:pPr>
+            <w:r>
+              <w:rPr>
+                <w:rFonts w:ascii="Calibri" w:hAnsi="Calibri" w:eastAsia="微软雅黑"/>
+                <w:b w:val="0"/>
+                <w:color w:val="202B31"/>
+                <w:sz w:val="16"/>
+              </w:rPr>
+              <w:t>•  《英语世界》杯全国大学生翻译大赛本科生组全国二等奖；NETCCS C 类省级三等奖</w:t>
+            </w:r>
+          </w:p>
+          <w:p>
+            <w:pPr>
+              <w:keepLines/>
+              <w:spacing w:before="0" w:after="24" w:line="250" w:lineRule="auto"/>
+            </w:pPr>
+            <w:r>
+              <w:rPr>
+                <w:rFonts w:ascii="Calibri" w:hAnsi="Calibri" w:eastAsia="微软雅黑"/>
+                <w:b w:val="0"/>
+                <w:color w:val="202B31"/>
+                <w:sz w:val="16"/>
+              </w:rPr>
+              <w:t>•  蓝桥杯 C/C++ 大学 A 组、码蹄杯北京赛区三等奖</w:t>
+            </w:r>
+          </w:p>
+          <w:p>
+            <w:pPr>
+              <w:keepLines/>
+              <w:spacing w:before="0" w:after="24" w:line="250" w:lineRule="auto"/>
+            </w:pPr>
+            <w:r>
+              <w:rPr>
+                <w:rFonts w:ascii="Calibri" w:hAnsi="Calibri" w:eastAsia="微软雅黑"/>
+                <w:b w:val="0"/>
+                <w:color w:val="202B31"/>
+                <w:sz w:val="16"/>
+              </w:rPr>
+              <w:t>•  第十一届屠龙勇士智能车大赛校二等奖（队长）；追梦杯机器人竞赛校三等奖</w:t>
+            </w:r>
+          </w:p>
+          <w:p>
+            <w:pPr>
+              <w:keepLines/>
+              <w:spacing w:before="0" w:after="24" w:line="250" w:lineRule="auto"/>
+            </w:pPr>
+            <w:r>
+              <w:rPr>
+                <w:rFonts w:ascii="Calibri" w:hAnsi="Calibri" w:eastAsia="微软雅黑"/>
+                <w:b w:val="0"/>
+                <w:color w:val="202B31"/>
+                <w:sz w:val="16"/>
+              </w:rPr>
+              <w:t>•  “博约杯”新生物理竞赛校一等奖</w:t>
+            </w:r>
+          </w:p>
+        </w:tc>
+      </w:tr>
+    </w:tbl>
     <w:sectPr>
-      <w:footerReference w:type="default" r:id="rId9"/>
-      <w:headerReference w:type="default" r:id="rId10"/>
       <w:pgSz w:w="11906" w:h="16838"/>
-      <w:pgMar w:top="850" w:right="1020" w:bottom="794" w:left="1020" w:header="397" w:footer="397" w:gutter="0"/>
+      <w:pgMar w:top="454" w:right="454" w:bottom="454" w:left="454" w:header="227" w:footer="227" w:gutter="0"/>
       <w:cols w:space="720"/>
       <w:docGrid w:linePitch="360"/>
     </w:sectPr>
   </w:body>
 </w:document>
-</file>
-
-<file path=word/footer1.xml><?xml version="1.0" encoding="utf-8"?>
-<w:ftr xmlns:m="http://schemas.openxmlformats.org/officeDocument/2006/math" xmlns:mc="http://schemas.openxmlformats.org/markup-compatibility/2006" xmlns:mo="http://schemas.microsoft.com/office/mac/office/2008/main" xmlns:mv="urn:schemas-microsoft-com:mac:vml" xmlns:o="urn:schemas-microsoft-com:office:office" xmlns:r="http://schemas.openxmlformats.org/officeDocument/2006/relationships" xmlns:v="urn:schemas-microsoft-com:vml" xmlns:w10="urn:schemas-microsoft-com:office:word" xmlns:w14="http://schemas.microsoft.com/office/word/2010/wordml" xmlns:w="http://schemas.openxmlformats.org/wordprocessingml/2006/main" xmlns:wne="http://schemas.microsoft.com/office/word/2006/wordml" xmlns:wp14="http://schemas.microsoft.com/office/word/2010/wordprocessingDrawing" xmlns:wp="http://schemas.openxmlformats.org/drawingml/2006/wordprocessingDrawing" xmlns:wpc="http://schemas.microsoft.com/office/word/2010/wordprocessingCanvas" xmlns:wpg="http://schemas.microsoft.com/office/word/2010/wordprocessingGroup" xmlns:wpi="http://schemas.microsoft.com/office/word/2010/wordprocessingInk" xmlns:wps="http://schemas.microsoft.com/office/word/2010/wordprocessingShape" mc:Ignorable="w14 wp14">
-  <w:p>
-    <w:pPr>
-      <w:pStyle w:val="Footer"/>
-      <w:jc w:val="right"/>
-    </w:pPr>
-    <w:r/>
-  </w:p>
-</w:ftr>
-</file>
-
-<file path=word/header1.xml><?xml version="1.0" encoding="utf-8"?>
-<w:hdr xmlns:m="http://schemas.openxmlformats.org/officeDocument/2006/math" xmlns:mc="http://schemas.openxmlformats.org/markup-compatibility/2006" xmlns:mo="http://schemas.microsoft.com/office/mac/office/2008/main" xmlns:mv="urn:schemas-microsoft-com:mac:vml" xmlns:o="urn:schemas-microsoft-com:office:office" xmlns:r="http://schemas.openxmlformats.org/officeDocument/2006/relationships" xmlns:v="urn:schemas-microsoft-com:vml" xmlns:w10="urn:schemas-microsoft-com:office:word" xmlns:w14="http://schemas.microsoft.com/office/word/2010/wordml" xmlns:w="http://schemas.openxmlformats.org/wordprocessingml/2006/main" xmlns:wne="http://schemas.microsoft.com/office/word/2006/wordml" xmlns:wp14="http://schemas.microsoft.com/office/word/2010/wordprocessingDrawing" xmlns:wp="http://schemas.openxmlformats.org/drawingml/2006/wordprocessingDrawing" xmlns:wpc="http://schemas.microsoft.com/office/word/2010/wordprocessingCanvas" xmlns:wpg="http://schemas.microsoft.com/office/word/2010/wordprocessingGroup" xmlns:wpi="http://schemas.microsoft.com/office/word/2010/wordprocessingInk" xmlns:wps="http://schemas.microsoft.com/office/word/2010/wordprocessingShape" mc:Ignorable="w14 wp14">
-  <w:p>
-    <w:pPr>
-      <w:pStyle w:val="Header"/>
-    </w:pPr>
-    <w:r/>
-  </w:p>
-</w:hdr>
 </file>
 
 <file path=word/numbering.xml><?xml version="1.0" encoding="utf-8"?>
@@ -781,12 +1471,12 @@
     <w:rsid w:val="00FC693F"/>
     <w:pPr>
       <w:widowControl/>
-      <w:spacing w:after="80" w:line="269" w:lineRule="auto"/>
+      <w:spacing w:after="0" w:line="252" w:lineRule="auto"/>
     </w:pPr>
     <w:rPr>
       <w:rFonts w:ascii="Calibri" w:hAnsi="Calibri" w:eastAsia="微软雅黑"/>
-      <w:color w:val="000000"/>
-      <w:sz w:val="19"/>
+      <w:color w:val="202B31"/>
+      <w:sz w:val="16"/>
     </w:rPr>
   </w:style>
   <w:style w:type="paragraph" w:styleId="Header">
@@ -844,15 +1534,15 @@
     <w:pPr>
       <w:keepNext/>
       <w:keepLines/>
-      <w:spacing w:before="160" w:after="80"/>
+      <w:spacing w:before="480" w:after="0"/>
       <w:outlineLvl w:val="0"/>
     </w:pPr>
     <w:rPr>
-      <w:rFonts w:asciiTheme="majorHAnsi" w:eastAsiaTheme="majorEastAsia" w:hAnsiTheme="majorHAnsi" w:cstheme="majorBidi" w:ascii="Calibri" w:hAnsi="Calibri" w:eastAsia="微软雅黑"/>
+      <w:rFonts w:asciiTheme="majorHAnsi" w:eastAsiaTheme="majorEastAsia" w:hAnsiTheme="majorHAnsi" w:cstheme="majorBidi"/>
       <w:b/>
       <w:bCs/>
-      <w:color w:val="000000"/>
-      <w:sz w:val="24"/>
+      <w:color w:val="365F91" w:themeColor="accent1" w:themeShade="BF"/>
+      <w:sz w:val="28"/>
       <w:szCs w:val="28"/>
     </w:rPr>
   </w:style>
@@ -872,10 +1562,10 @@
       <w:outlineLvl w:val="1"/>
     </w:pPr>
     <w:rPr>
-      <w:rFonts w:asciiTheme="majorHAnsi" w:eastAsiaTheme="majorEastAsia" w:hAnsiTheme="majorHAnsi" w:cstheme="majorBidi" w:ascii="Calibri" w:hAnsi="Calibri" w:eastAsia="微软雅黑"/>
+      <w:rFonts w:asciiTheme="majorHAnsi" w:eastAsiaTheme="majorEastAsia" w:hAnsiTheme="majorHAnsi" w:cstheme="majorBidi"/>
       <w:b/>
       <w:bCs/>
-      <w:color w:val="000000"/>
+      <w:color w:val="4F81BD" w:themeColor="accent1"/>
       <w:sz w:val="26"/>
       <w:szCs w:val="26"/>
     </w:rPr>
@@ -1130,16 +1820,18 @@
     <w:qFormat/>
     <w:rsid w:val="00FC693F"/>
     <w:pPr>
-      <w:spacing w:after="60" w:line="240" w:lineRule="auto"/>
+      <w:pBdr>
+        <w:bottom w:val="single" w:sz="8" w:space="4" w:color="4F81BD" w:themeColor="accent1"/>
+      </w:pBdr>
+      <w:spacing w:after="300" w:line="240" w:lineRule="auto"/>
       <w:contextualSpacing/>
     </w:pPr>
     <w:rPr>
-      <w:rFonts w:asciiTheme="majorHAnsi" w:eastAsiaTheme="majorEastAsia" w:hAnsiTheme="majorHAnsi" w:cstheme="majorBidi" w:ascii="Calibri" w:hAnsi="Calibri" w:eastAsia="微软雅黑"/>
-      <w:b/>
-      <w:color w:val="000000"/>
+      <w:rFonts w:asciiTheme="majorHAnsi" w:eastAsiaTheme="majorEastAsia" w:hAnsiTheme="majorHAnsi" w:cstheme="majorBidi"/>
+      <w:color w:val="17365D" w:themeColor="text2" w:themeShade="BF"/>
       <w:spacing w:val="5"/>
       <w:kern w:val="28"/>
-      <w:sz w:val="54"/>
+      <w:sz w:val="52"/>
       <w:szCs w:val="52"/>
     </w:rPr>
   </w:style>
@@ -12468,32 +13160,6 @@
         <w:shd w:val="clear" w:color="auto" w:fill="FBCAA2" w:themeFill="accent6" w:themeFillTint="7F"/>
       </w:tcPr>
     </w:tblStylePr>
-  </w:style>
-  <w:style w:type="paragraph" w:customStyle="1" w:styleId="CVHeading">
-    <w:name w:val="CV Heading"/>
-    <w:pPr>
-      <w:keepNext/>
-      <w:spacing w:before="120" w:after="40"/>
-    </w:pPr>
-    <w:rPr>
-      <w:rFonts w:ascii="Aptos" w:hAnsi="Aptos"/>
-      <w:b/>
-      <w:color w:val="173454"/>
-      <w:sz w:val="20"/>
-    </w:rPr>
-  </w:style>
-  <w:style w:type="paragraph" w:customStyle="1" w:styleId="CVProject">
-    <w:name w:val="CV Project"/>
-    <w:pPr>
-      <w:keepNext/>
-      <w:spacing w:before="80" w:after="40"/>
-    </w:pPr>
-    <w:rPr>
-      <w:rFonts w:ascii="Aptos" w:hAnsi="Aptos"/>
-      <w:b/>
-      <w:color w:val="173454"/>
-      <w:sz w:val="18"/>
-    </w:rPr>
   </w:style>
 </w:styles>
 </file>

</xml_diff>

<commit_message>
Clarify robotics research methods and add embedded skills
</commit_message>
<xml_diff>
--- a/Chenxu_Wang_Academic_CV.docx
+++ b/Chenxu_Wang_Academic_CV.docx
@@ -91,7 +91,7 @@
                 <w:rFonts w:ascii="Calibri" w:hAnsi="Calibri" w:eastAsia="微软雅黑"/>
                 <w:b/>
                 <w:color w:val="DDEBF2"/>
-                <w:sz w:val="18"/>
+                <w:sz w:val="20"/>
               </w:rPr>
               <w:t>教育背景</w:t>
             </w:r>
@@ -106,7 +106,7 @@
                 <w:rFonts w:ascii="Calibri" w:hAnsi="Calibri" w:eastAsia="微软雅黑"/>
                 <w:b/>
                 <w:color w:val="FFFFFF"/>
-                <w:sz w:val="18"/>
+                <w:sz w:val="16"/>
               </w:rPr>
               <w:t>北京理工大学</w:t>
             </w:r>
@@ -121,7 +121,7 @@
                 <w:rFonts w:ascii="Calibri" w:hAnsi="Calibri" w:eastAsia="微软雅黑"/>
                 <w:b w:val="0"/>
                 <w:color w:val="FFFFFF"/>
-                <w:sz w:val="15"/>
+                <w:sz w:val="16"/>
               </w:rPr>
               <w:t>信息与电子学院 · 电子信息工程</w:t>
             </w:r>
@@ -136,7 +136,7 @@
                 <w:rFonts w:ascii="Calibri" w:hAnsi="Calibri" w:eastAsia="微软雅黑"/>
                 <w:b w:val="0"/>
                 <w:color w:val="DDEBF2"/>
-                <w:sz w:val="15"/>
+                <w:sz w:val="16"/>
               </w:rPr>
               <w:t>本科在读  |  2025.09—至今</w:t>
             </w:r>
@@ -153,7 +153,7 @@
                 <w:color w:val="FFFFFF"/>
                 <w:sz w:val="16"/>
               </w:rPr>
-              <w:t>学年纯成绩排名  2 / 230</w:t>
+              <w:t>纯成绩  2 / 230 · 前 0.87%</w:t>
             </w:r>
           </w:p>
           <w:p>
@@ -168,7 +168,7 @@
                 <w:color w:val="FFFFFF"/>
                 <w:sz w:val="16"/>
               </w:rPr>
-              <w:t>综合测评排名  1 / 230</w:t>
+              <w:t>综合测评  1 / 230 · 前 0.43%</w:t>
             </w:r>
           </w:p>
           <w:p>
@@ -189,6 +189,21 @@
           <w:p>
             <w:pPr>
               <w:keepLines/>
+              <w:spacing w:before="0" w:after="20" w:line="259" w:lineRule="auto"/>
+            </w:pPr>
+            <w:r>
+              <w:rPr>
+                <w:rFonts w:ascii="Calibri" w:hAnsi="Calibri" w:eastAsia="微软雅黑"/>
+                <w:b/>
+                <w:color w:val="DDEBF2"/>
+                <w:sz w:val="16"/>
+              </w:rPr>
+              <w:t>国家奖学金</w:t>
+            </w:r>
+          </w:p>
+          <w:p>
+            <w:pPr>
+              <w:keepLines/>
               <w:spacing w:before="100" w:after="50" w:line="240" w:lineRule="auto"/>
               <w:pBdr>
                 <w:bottom w:val="single" w:sz="5" w:space="2" w:color="DDEBF2"/>
@@ -199,7 +214,7 @@
                 <w:rFonts w:ascii="Calibri" w:hAnsi="Calibri" w:eastAsia="微软雅黑"/>
                 <w:b/>
                 <w:color w:val="DDEBF2"/>
-                <w:sz w:val="18"/>
+                <w:sz w:val="20"/>
               </w:rPr>
               <w:t>研究兴趣</w:t>
             </w:r>
@@ -229,7 +244,7 @@
                 <w:rFonts w:ascii="Calibri" w:hAnsi="Calibri" w:eastAsia="微软雅黑"/>
                 <w:b w:val="0"/>
                 <w:color w:val="FFFFFF"/>
-                <w:sz w:val="15"/>
+                <w:sz w:val="16"/>
               </w:rPr>
               <w:t>机器人运动重定向与学习</w:t>
             </w:r>
@@ -244,7 +259,7 @@
                 <w:rFonts w:ascii="Calibri" w:hAnsi="Calibri" w:eastAsia="微软雅黑"/>
                 <w:b w:val="0"/>
                 <w:color w:val="FFFFFF"/>
-                <w:sz w:val="15"/>
+                <w:sz w:val="16"/>
               </w:rPr>
               <w:t>可穿戴感知与人机交互</w:t>
             </w:r>
@@ -262,7 +277,7 @@
                 <w:rFonts w:ascii="Calibri" w:hAnsi="Calibri" w:eastAsia="微软雅黑"/>
                 <w:b/>
                 <w:color w:val="DDEBF2"/>
-                <w:sz w:val="18"/>
+                <w:sz w:val="20"/>
               </w:rPr>
               <w:t>技术能力</w:t>
             </w:r>
@@ -277,9 +292,9 @@
                 <w:rFonts w:ascii="Calibri" w:hAnsi="Calibri" w:eastAsia="微软雅黑"/>
                 <w:b w:val="0"/>
                 <w:color w:val="FFFFFF"/>
-                <w:sz w:val="15"/>
+                <w:sz w:val="16"/>
               </w:rPr>
-              <w:t>编程  Python · C/C++ · Arduino</w:t>
+              <w:t>嵌入式  STM32 · Arduino · C/C++</w:t>
             </w:r>
           </w:p>
           <w:p>
@@ -292,9 +307,9 @@
                 <w:rFonts w:ascii="Calibri" w:hAnsi="Calibri" w:eastAsia="微软雅黑"/>
                 <w:b w:val="0"/>
                 <w:color w:val="FFFFFF"/>
-                <w:sz w:val="15"/>
+                <w:sz w:val="16"/>
               </w:rPr>
-              <w:t>计算  NumPy · SciPy · scikit-learn</w:t>
+              <w:t>算法  Python · NumPy · SciPy · sklearn</w:t>
             </w:r>
           </w:p>
           <w:p>
@@ -307,9 +322,9 @@
                 <w:rFonts w:ascii="Calibri" w:hAnsi="Calibri" w:eastAsia="微软雅黑"/>
                 <w:b w:val="0"/>
                 <w:color w:val="FFFFFF"/>
-                <w:sz w:val="15"/>
+                <w:sz w:val="16"/>
               </w:rPr>
-              <w:t>机器人  正逆运动学 · 约束优化</w:t>
+              <w:t>机器人  正逆运动学 · 雅可比 · IK</w:t>
             </w:r>
           </w:p>
           <w:p>
@@ -322,9 +337,24 @@
                 <w:rFonts w:ascii="Calibri" w:hAnsi="Calibri" w:eastAsia="微软雅黑"/>
                 <w:b w:val="0"/>
                 <w:color w:val="FFFFFF"/>
-                <w:sz w:val="15"/>
+                <w:sz w:val="16"/>
               </w:rPr>
-              <w:t>系统  BLE · Git · Linux · MuJoCo</w:t>
+              <w:t>工程  BLE · 传感采集 · Git · Linux</w:t>
+            </w:r>
+          </w:p>
+          <w:p>
+            <w:pPr>
+              <w:keepLines/>
+              <w:spacing w:before="0" w:after="24" w:line="259" w:lineRule="auto"/>
+            </w:pPr>
+            <w:r>
+              <w:rPr>
+                <w:rFonts w:ascii="Calibri" w:hAnsi="Calibri" w:eastAsia="微软雅黑"/>
+                <w:b w:val="0"/>
+                <w:color w:val="FFFFFF"/>
+                <w:sz w:val="16"/>
+              </w:rPr>
+              <w:t>仿真  MuJoCo</w:t>
             </w:r>
           </w:p>
           <w:p>
@@ -340,7 +370,7 @@
                 <w:rFonts w:ascii="Calibri" w:hAnsi="Calibri" w:eastAsia="微软雅黑"/>
                 <w:b/>
                 <w:color w:val="DDEBF2"/>
-                <w:sz w:val="18"/>
+                <w:sz w:val="20"/>
               </w:rPr>
               <w:t>联系与作品</w:t>
             </w:r>
@@ -355,7 +385,7 @@
                 <w:rFonts w:ascii="Calibri" w:hAnsi="Calibri" w:eastAsia="微软雅黑"/>
                 <w:b w:val="0"/>
                 <w:color w:val="FFFFFF"/>
-                <w:sz w:val="14"/>
+                <w:sz w:val="16"/>
               </w:rPr>
               <w:t>chenxuwang.chn@outlook.com</w:t>
             </w:r>
@@ -370,7 +400,7 @@
                 <w:rFonts w:ascii="Calibri" w:hAnsi="Calibri" w:eastAsia="微软雅黑"/>
                 <w:b w:val="0"/>
                 <w:color w:val="FFFFFF"/>
-                <w:sz w:val="15"/>
+                <w:sz w:val="16"/>
               </w:rPr>
               <w:t>lucianwangchn.github.io</w:t>
             </w:r>
@@ -385,7 +415,7 @@
                 <w:rFonts w:ascii="Calibri" w:hAnsi="Calibri" w:eastAsia="微软雅黑"/>
                 <w:b w:val="0"/>
                 <w:color w:val="DDEBF2"/>
-                <w:sz w:val="14"/>
+                <w:sz w:val="16"/>
               </w:rPr>
               <w:t>github.com/LucianWangChn</w:t>
             </w:r>
@@ -471,7 +501,7 @@
                 <w:color w:val="173B52"/>
                 <w:sz w:val="20"/>
               </w:rPr>
-              <w:t>研究与项目经历</w:t>
+              <w:t>科研与项目经历</w:t>
             </w:r>
           </w:p>
           <w:tbl>
@@ -490,13 +520,13 @@
               </w:tblBorders>
             </w:tblPr>
             <w:tblGrid>
-              <w:gridCol w:w="5953"/>
+              <w:gridCol w:w="5783"/>
               <w:gridCol w:w="1644"/>
             </w:tblGrid>
             <w:tr>
               <w:tc>
                 <w:tcPr>
-                  <w:tcW w:type="dxa" w:w="5953"/>
+                  <w:tcW w:type="dxa" w:w="5783"/>
                   <w:tcMar>
                     <w:top w:w="0" w:type="dxa"/>
                     <w:start w:w="0" w:type="dxa"/>
@@ -515,18 +545,18 @@
                       <w:rFonts w:ascii="Calibri" w:hAnsi="Calibri" w:eastAsia="微软雅黑"/>
                       <w:b/>
                       <w:color w:val="202B31"/>
-                      <w:sz w:val="18"/>
+                      <w:sz w:val="19"/>
                     </w:rPr>
-                    <w:t>灵巧手异构运动重定向  DOGlove × ORCA</w:t>
+                    <w:t>DOGlove × ORCA 灵巧手运动重定向</w:t>
                   </w:r>
                   <w:r>
                     <w:rPr>
                       <w:rFonts w:ascii="Calibri" w:hAnsi="Calibri" w:eastAsia="微软雅黑"/>
                       <w:b w:val="0"/>
                       <w:color w:val="3B7391"/>
-                      <w:sz w:val="15"/>
+                      <w:sz w:val="16"/>
                     </w:rPr>
-                    <w:t xml:space="preserve">  |  运动学建模与算法实践</w:t>
+                    <w:t xml:space="preserve">  |  运动学与算法研究</w:t>
                   </w:r>
                 </w:p>
               </w:tc>
@@ -552,7 +582,7 @@
                       <w:rFonts w:ascii="Calibri" w:hAnsi="Calibri" w:eastAsia="微软雅黑"/>
                       <w:b w:val="0"/>
                       <w:color w:val="5B6870"/>
-                      <w:sz w:val="15"/>
+                      <w:sz w:val="16"/>
                     </w:rPr>
                     <w:t>2026—至今</w:t>
                   </w:r>
@@ -571,9 +601,9 @@
                 <w:rFonts w:ascii="Calibri" w:hAnsi="Calibri" w:eastAsia="微软雅黑"/>
                 <w:b w:val="0"/>
                 <w:color w:val="202B31"/>
-                <w:sz w:val="17"/>
+                <w:sz w:val="18"/>
               </w:rPr>
-              <w:t>方法与贡献｜针对佩戴零位和手部构型差异，建立平手标定与逐指掌坐标映射；采用受关节范围约束的指尖逆运动学，并在零空间中加入弱姿态偏好。</w:t>
+              <w:t>研究问题与方法｜问题：手套与 ORCA 在指长、关节构型和重新佩戴后的零位上存在差异，逐关节复制角度难以保持捏合所需的指尖关系。方法：以本次平手为锚点，在掌坐标系中构造逐指空间位移映射；通过受关节限位的指尖 IK 求解，并将弱姿态先验投影到任务雅可比矩阵的零空间。</w:t>
             </w:r>
           </w:p>
           <w:p>
@@ -588,7 +618,7 @@
                 <w:color w:val="5B6870"/>
                 <w:sz w:val="17"/>
               </w:rPr>
-              <w:t>成果｜整理 223 条姿态记录并开展离线保留测试，参考关节 RMSE 由 23.56° 降至 23.20°。</w:t>
+              <w:t>实验设计与结果｜223 条原始记录经筛选后形成 155 条训练、50 条按姿态 ID 留出的测试和 5 条诊断记录。在离线运动学回放中比较基础指尖 IK 与加入弱姿态先验的方案：相对 ORCA 参考关节的 RMSE 为 23.56°→23.20°，相对参考指尖位置的平均误差为 32.22→32.05 mm，IK 目标残差为 2.84→2.86 mm。</w:t>
             </w:r>
           </w:p>
           <w:tbl>
@@ -607,13 +637,13 @@
               </w:tblBorders>
             </w:tblPr>
             <w:tblGrid>
-              <w:gridCol w:w="5953"/>
+              <w:gridCol w:w="5783"/>
               <w:gridCol w:w="1644"/>
             </w:tblGrid>
             <w:tr>
               <w:tc>
                 <w:tcPr>
-                  <w:tcW w:type="dxa" w:w="5953"/>
+                  <w:tcW w:type="dxa" w:w="5783"/>
                   <w:tcMar>
                     <w:top w:w="0" w:type="dxa"/>
                     <w:start w:w="0" w:type="dxa"/>
@@ -632,7 +662,7 @@
                       <w:rFonts w:ascii="Calibri" w:hAnsi="Calibri" w:eastAsia="微软雅黑"/>
                       <w:b/>
                       <w:color w:val="202B31"/>
-                      <w:sz w:val="18"/>
+                      <w:sz w:val="19"/>
                     </w:rPr>
                     <w:t>SIGNSPEAK 多模态情感转译手语手套</w:t>
                   </w:r>
@@ -641,7 +671,7 @@
                       <w:rFonts w:ascii="Calibri" w:hAnsi="Calibri" w:eastAsia="微软雅黑"/>
                       <w:b w:val="0"/>
                       <w:color w:val="3B7391"/>
-                      <w:sz w:val="15"/>
+                      <w:sz w:val="16"/>
                     </w:rPr>
                     <w:t xml:space="preserve">  |  主要研发</w:t>
                   </w:r>
@@ -664,14 +694,6 @@
                     <w:spacing w:before="0" w:after="8" w:line="240" w:lineRule="auto"/>
                     <w:jc w:val="right"/>
                   </w:pPr>
-                  <w:r>
-                    <w:rPr>
-                      <w:rFonts w:ascii="Calibri" w:hAnsi="Calibri" w:eastAsia="微软雅黑"/>
-                      <w:b w:val="0"/>
-                      <w:color w:val="5B6870"/>
-                      <w:sz w:val="15"/>
-                    </w:rPr>
-                  </w:r>
                 </w:p>
               </w:tc>
             </w:tr>
@@ -687,9 +709,9 @@
                 <w:rFonts w:ascii="Calibri" w:hAnsi="Calibri" w:eastAsia="微软雅黑"/>
                 <w:b w:val="0"/>
                 <w:color w:val="202B31"/>
-                <w:sz w:val="17"/>
+                <w:sz w:val="18"/>
               </w:rPr>
-              <w:t>方法与贡献｜除三维建模与 PPT 外，基本独立完成方案、硬件、Arduino 固件和 Python 程序；实现 BLE 传感采集与随机森林手势识别，集成 Wav2Vec2 声学分析、ASR/LLM 语义分析及显示和振动反馈。</w:t>
+              <w:t>项目内容与个人工作｜除三维建模与 PPT 外，基本独立完成方案、硬件、Arduino 固件和 Python 程序；实现 BLE 传感采集与随机森林手势识别，集成 Wav2Vec2 声学分析、ASR/LLM 语义分析及显示和振动反馈。</w:t>
             </w:r>
           </w:p>
           <w:p>
@@ -704,7 +726,7 @@
                 <w:color w:val="5B6870"/>
                 <w:sz w:val="17"/>
               </w:rPr>
-              <w:t>成果｜完成可穿戴原型及手势采集—训练—预测流程，集成声学、语义和触觉反馈。</w:t>
+              <w:t>项目结果｜完成可穿戴原型及手势采集—训练—预测流程，集成声学、语义和触觉反馈。</w:t>
             </w:r>
           </w:p>
           <w:tbl>
@@ -723,13 +745,13 @@
               </w:tblBorders>
             </w:tblPr>
             <w:tblGrid>
-              <w:gridCol w:w="5953"/>
+              <w:gridCol w:w="5783"/>
               <w:gridCol w:w="1644"/>
             </w:tblGrid>
             <w:tr>
               <w:tc>
                 <w:tcPr>
-                  <w:tcW w:type="dxa" w:w="5953"/>
+                  <w:tcW w:type="dxa" w:w="5783"/>
                   <w:tcMar>
                     <w:top w:w="0" w:type="dxa"/>
                     <w:start w:w="0" w:type="dxa"/>
@@ -748,7 +770,7 @@
                       <w:rFonts w:ascii="Calibri" w:hAnsi="Calibri" w:eastAsia="微软雅黑"/>
                       <w:b/>
                       <w:color w:val="202B31"/>
-                      <w:sz w:val="18"/>
+                      <w:sz w:val="19"/>
                     </w:rPr>
                     <w:t>星居 AI 端云协同智慧空间</w:t>
                   </w:r>
@@ -757,7 +779,7 @@
                       <w:rFonts w:ascii="Calibri" w:hAnsi="Calibri" w:eastAsia="微软雅黑"/>
                       <w:b w:val="0"/>
                       <w:color w:val="3B7391"/>
-                      <w:sz w:val="15"/>
+                      <w:sz w:val="16"/>
                     </w:rPr>
                     <w:t xml:space="preserve">  |  项目负责人</w:t>
                   </w:r>
@@ -780,14 +802,6 @@
                     <w:spacing w:before="0" w:after="8" w:line="240" w:lineRule="auto"/>
                     <w:jc w:val="right"/>
                   </w:pPr>
-                  <w:r>
-                    <w:rPr>
-                      <w:rFonts w:ascii="Calibri" w:hAnsi="Calibri" w:eastAsia="微软雅黑"/>
-                      <w:b w:val="0"/>
-                      <w:color w:val="5B6870"/>
-                      <w:sz w:val="15"/>
-                    </w:rPr>
-                  </w:r>
                 </w:p>
               </w:tc>
             </w:tr>
@@ -803,9 +817,9 @@
                 <w:rFonts w:ascii="Calibri" w:hAnsi="Calibri" w:eastAsia="微软雅黑"/>
                 <w:b w:val="0"/>
                 <w:color w:val="202B31"/>
-                <w:sz w:val="17"/>
+                <w:sz w:val="18"/>
               </w:rPr>
-              <w:t>方法与贡献｜负责桌面智能体、状态与偏好记忆及决策逻辑；连接华为云 IoTDA 与实体设备，整合命令解释、动作派发和状态回读，推进端云系统联调。</w:t>
+              <w:t>项目内容与个人工作｜负责桌面智能体、状态与偏好记忆及决策逻辑；连接华为云 IoTDA 与实体设备，整合命令解释、动作派发和状态回读，推进端云系统联调。</w:t>
             </w:r>
           </w:p>
           <w:p>
@@ -820,7 +834,7 @@
                 <w:color w:val="5B6870"/>
                 <w:sz w:val="17"/>
               </w:rPr>
-              <w:t>成果｜完成端云设备联调与演示；当前正备战国创赛省赛金奖争夺赛。</w:t>
+              <w:t>项目进展｜完成端云设备联调与演示；当前正备战国创赛省赛金奖争夺赛。</w:t>
             </w:r>
           </w:p>
           <w:tbl>
@@ -839,13 +853,13 @@
               </w:tblBorders>
             </w:tblPr>
             <w:tblGrid>
-              <w:gridCol w:w="5953"/>
+              <w:gridCol w:w="5783"/>
               <w:gridCol w:w="1644"/>
             </w:tblGrid>
             <w:tr>
               <w:tc>
                 <w:tcPr>
-                  <w:tcW w:type="dxa" w:w="5953"/>
+                  <w:tcW w:type="dxa" w:w="5783"/>
                   <w:tcMar>
                     <w:top w:w="0" w:type="dxa"/>
                     <w:start w:w="0" w:type="dxa"/>
@@ -864,7 +878,7 @@
                       <w:rFonts w:ascii="Calibri" w:hAnsi="Calibri" w:eastAsia="微软雅黑"/>
                       <w:b/>
                       <w:color w:val="202B31"/>
-                      <w:sz w:val="18"/>
+                      <w:sz w:val="19"/>
                     </w:rPr>
                     <w:t>机器人与智能车工程实践</w:t>
                   </w:r>
@@ -873,7 +887,7 @@
                       <w:rFonts w:ascii="Calibri" w:hAnsi="Calibri" w:eastAsia="微软雅黑"/>
                       <w:b w:val="0"/>
                       <w:color w:val="3B7391"/>
-                      <w:sz w:val="15"/>
+                      <w:sz w:val="16"/>
                     </w:rPr>
                     <w:t xml:space="preserve">  |  屠龙队长 · 校机器人队</w:t>
                   </w:r>
@@ -901,7 +915,7 @@
                       <w:rFonts w:ascii="Calibri" w:hAnsi="Calibri" w:eastAsia="微软雅黑"/>
                       <w:b w:val="0"/>
                       <w:color w:val="5B6870"/>
-                      <w:sz w:val="15"/>
+                      <w:sz w:val="16"/>
                     </w:rPr>
                     <w:t>2025—2026</w:t>
                   </w:r>
@@ -920,9 +934,9 @@
                 <w:rFonts w:ascii="Calibri" w:hAnsi="Calibri" w:eastAsia="微软雅黑"/>
                 <w:b w:val="0"/>
                 <w:color w:val="202B31"/>
-                <w:sz w:val="17"/>
+                <w:sz w:val="18"/>
               </w:rPr>
-              <w:t>方法与贡献｜担任屠龙队队长，参与底盘与传感器搭建、电机接入、嵌入式固件调试及赛道测试，组织多轮软硬件联调。</w:t>
+              <w:t>项目内容与个人工作｜担任屠龙队队长，参与底盘与传感器搭建、电机接入、嵌入式固件调试及赛道测试，组织多轮软硬件联调。</w:t>
             </w:r>
           </w:p>
           <w:p>
@@ -937,7 +951,7 @@
                 <w:color w:val="5B6870"/>
                 <w:sz w:val="17"/>
               </w:rPr>
-              <w:t>成果｜完成不同机器人平台的搭建、调试与赛道验证，积累软硬件协同经验。</w:t>
+              <w:t>项目结果｜完成不同机器人平台的搭建、调试与赛道验证，积累软硬件协同经验。</w:t>
             </w:r>
           </w:p>
           <w:p>
@@ -956,21 +970,6 @@
                 <w:sz w:val="20"/>
               </w:rPr>
               <w:t>竞赛获奖与荣誉</w:t>
-            </w:r>
-          </w:p>
-          <w:p>
-            <w:pPr>
-              <w:keepLines/>
-              <w:spacing w:before="0" w:after="24" w:line="250" w:lineRule="auto"/>
-            </w:pPr>
-            <w:r>
-              <w:rPr>
-                <w:rFonts w:ascii="Calibri" w:hAnsi="Calibri" w:eastAsia="微软雅黑"/>
-                <w:b w:val="0"/>
-                <w:color w:val="202B31"/>
-                <w:sz w:val="16"/>
-              </w:rPr>
-              <w:t>•  国家奖学金</w:t>
             </w:r>
           </w:p>
           <w:p>

</xml_diff>

<commit_message>
Expand Chinese CV project explanations
</commit_message>
<xml_diff>
--- a/Chenxu_Wang_Academic_CV.docx
+++ b/Chenxu_Wang_Academic_CV.docx
@@ -106,7 +106,7 @@
                 <w:rFonts w:ascii="Calibri" w:hAnsi="Calibri" w:eastAsia="微软雅黑"/>
                 <w:b/>
                 <w:color w:val="FFFFFF"/>
-                <w:sz w:val="16"/>
+                <w:sz w:val="18"/>
               </w:rPr>
               <w:t>北京理工大学</w:t>
             </w:r>
@@ -121,7 +121,7 @@
                 <w:rFonts w:ascii="Calibri" w:hAnsi="Calibri" w:eastAsia="微软雅黑"/>
                 <w:b w:val="0"/>
                 <w:color w:val="FFFFFF"/>
-                <w:sz w:val="16"/>
+                <w:sz w:val="18"/>
               </w:rPr>
               <w:t>信息与电子学院 · 电子信息工程</w:t>
             </w:r>
@@ -136,7 +136,7 @@
                 <w:rFonts w:ascii="Calibri" w:hAnsi="Calibri" w:eastAsia="微软雅黑"/>
                 <w:b w:val="0"/>
                 <w:color w:val="DDEBF2"/>
-                <w:sz w:val="16"/>
+                <w:sz w:val="18"/>
               </w:rPr>
               <w:t>本科在读  |  2025.09—至今</w:t>
             </w:r>
@@ -151,7 +151,7 @@
                 <w:rFonts w:ascii="Calibri" w:hAnsi="Calibri" w:eastAsia="微软雅黑"/>
                 <w:b/>
                 <w:color w:val="FFFFFF"/>
-                <w:sz w:val="16"/>
+                <w:sz w:val="18"/>
               </w:rPr>
               <w:t>纯成绩  2 / 230 · 前 0.87%</w:t>
             </w:r>
@@ -166,7 +166,7 @@
                 <w:rFonts w:ascii="Calibri" w:hAnsi="Calibri" w:eastAsia="微软雅黑"/>
                 <w:b/>
                 <w:color w:val="FFFFFF"/>
-                <w:sz w:val="16"/>
+                <w:sz w:val="18"/>
               </w:rPr>
               <w:t>综合测评  1 / 230 · 前 0.43%</w:t>
             </w:r>
@@ -181,7 +181,7 @@
                 <w:rFonts w:ascii="Calibri" w:hAnsi="Calibri" w:eastAsia="微软雅黑"/>
                 <w:b w:val="0"/>
                 <w:color w:val="FFFFFF"/>
-                <w:sz w:val="16"/>
+                <w:sz w:val="18"/>
               </w:rPr>
               <w:t>CET-4  613</w:t>
             </w:r>
@@ -196,7 +196,7 @@
                 <w:rFonts w:ascii="Calibri" w:hAnsi="Calibri" w:eastAsia="微软雅黑"/>
                 <w:b/>
                 <w:color w:val="DDEBF2"/>
-                <w:sz w:val="16"/>
+                <w:sz w:val="18"/>
               </w:rPr>
               <w:t>国家奖学金</w:t>
             </w:r>
@@ -229,7 +229,7 @@
                 <w:rFonts w:ascii="Calibri" w:hAnsi="Calibri" w:eastAsia="微软雅黑"/>
                 <w:b/>
                 <w:color w:val="FFFFFF"/>
-                <w:sz w:val="16"/>
+                <w:sz w:val="18"/>
               </w:rPr>
               <w:t>具身智能 · 灵巧操作</w:t>
             </w:r>
@@ -244,7 +244,7 @@
                 <w:rFonts w:ascii="Calibri" w:hAnsi="Calibri" w:eastAsia="微软雅黑"/>
                 <w:b w:val="0"/>
                 <w:color w:val="FFFFFF"/>
-                <w:sz w:val="16"/>
+                <w:sz w:val="18"/>
               </w:rPr>
               <w:t>机器人运动重定向与学习</w:t>
             </w:r>
@@ -259,7 +259,7 @@
                 <w:rFonts w:ascii="Calibri" w:hAnsi="Calibri" w:eastAsia="微软雅黑"/>
                 <w:b w:val="0"/>
                 <w:color w:val="FFFFFF"/>
-                <w:sz w:val="16"/>
+                <w:sz w:val="18"/>
               </w:rPr>
               <w:t>可穿戴感知与人机交互</w:t>
             </w:r>
@@ -292,7 +292,7 @@
                 <w:rFonts w:ascii="Calibri" w:hAnsi="Calibri" w:eastAsia="微软雅黑"/>
                 <w:b w:val="0"/>
                 <w:color w:val="FFFFFF"/>
-                <w:sz w:val="16"/>
+                <w:sz w:val="18"/>
               </w:rPr>
               <w:t>嵌入式  STM32 · Arduino · C/C++</w:t>
             </w:r>
@@ -307,7 +307,7 @@
                 <w:rFonts w:ascii="Calibri" w:hAnsi="Calibri" w:eastAsia="微软雅黑"/>
                 <w:b w:val="0"/>
                 <w:color w:val="FFFFFF"/>
-                <w:sz w:val="16"/>
+                <w:sz w:val="18"/>
               </w:rPr>
               <w:t>算法  Python · NumPy · SciPy · sklearn</w:t>
             </w:r>
@@ -322,7 +322,7 @@
                 <w:rFonts w:ascii="Calibri" w:hAnsi="Calibri" w:eastAsia="微软雅黑"/>
                 <w:b w:val="0"/>
                 <w:color w:val="FFFFFF"/>
-                <w:sz w:val="16"/>
+                <w:sz w:val="18"/>
               </w:rPr>
               <w:t>机器人  正逆运动学 · 雅可比 · IK</w:t>
             </w:r>
@@ -337,7 +337,7 @@
                 <w:rFonts w:ascii="Calibri" w:hAnsi="Calibri" w:eastAsia="微软雅黑"/>
                 <w:b w:val="0"/>
                 <w:color w:val="FFFFFF"/>
-                <w:sz w:val="16"/>
+                <w:sz w:val="18"/>
               </w:rPr>
               <w:t>工程  BLE · 传感采集 · Git · Linux</w:t>
             </w:r>
@@ -352,7 +352,7 @@
                 <w:rFonts w:ascii="Calibri" w:hAnsi="Calibri" w:eastAsia="微软雅黑"/>
                 <w:b w:val="0"/>
                 <w:color w:val="FFFFFF"/>
-                <w:sz w:val="16"/>
+                <w:sz w:val="18"/>
               </w:rPr>
               <w:t>仿真  MuJoCo</w:t>
             </w:r>
@@ -385,7 +385,7 @@
                 <w:rFonts w:ascii="Calibri" w:hAnsi="Calibri" w:eastAsia="微软雅黑"/>
                 <w:b w:val="0"/>
                 <w:color w:val="FFFFFF"/>
-                <w:sz w:val="16"/>
+                <w:sz w:val="18"/>
               </w:rPr>
               <w:t>chenxuwang.chn@outlook.com</w:t>
             </w:r>
@@ -400,7 +400,7 @@
                 <w:rFonts w:ascii="Calibri" w:hAnsi="Calibri" w:eastAsia="微软雅黑"/>
                 <w:b w:val="0"/>
                 <w:color w:val="FFFFFF"/>
-                <w:sz w:val="16"/>
+                <w:sz w:val="18"/>
               </w:rPr>
               <w:t>lucianwangchn.github.io</w:t>
             </w:r>
@@ -415,7 +415,7 @@
                 <w:rFonts w:ascii="Calibri" w:hAnsi="Calibri" w:eastAsia="微软雅黑"/>
                 <w:b w:val="0"/>
                 <w:color w:val="DDEBF2"/>
-                <w:sz w:val="16"/>
+                <w:sz w:val="18"/>
               </w:rPr>
               <w:t>github.com/LucianWangChn</w:t>
             </w:r>
@@ -603,7 +603,7 @@
                 <w:color w:val="202B31"/>
                 <w:sz w:val="18"/>
               </w:rPr>
-              <w:t>研究问题与方法｜问题：手套与 ORCA 在指长、关节构型和重新佩戴后的零位上存在差异，逐关节复制角度难以保持捏合所需的指尖关系。方法：以本次平手为锚点，在掌坐标系中构造逐指空间位移映射；通过受关节限位的指尖 IK 求解，并将弱姿态先验投影到任务雅可比矩阵的零空间。</w:t>
+              <w:t>研究问题与方法｜人手、手套与 ORCA 的指长、关节结构和佩戴零位不同，直接复制关节角会使捏合指尖错位。每次佩戴先以平手姿态重新定零；再将手指传感角经正运动学换成掌坐标系下的指尖位移，逐指映射为 ORCA 的指尖目标，并在关节限位内用逆运动学求解。最后利用任务雅可比零空间加入弱关节姿态偏好，尽量不改变指尖目标。</w:t>
             </w:r>
           </w:p>
           <w:p>
@@ -616,9 +616,9 @@
                 <w:rFonts w:ascii="Calibri" w:hAnsi="Calibri" w:eastAsia="微软雅黑"/>
                 <w:b w:val="0"/>
                 <w:color w:val="5B6870"/>
-                <w:sz w:val="17"/>
+                <w:sz w:val="18"/>
               </w:rPr>
-              <w:t>实验设计与结果｜223 条原始记录经筛选后形成 155 条训练、50 条按姿态 ID 留出的测试和 5 条诊断记录。在离线运动学回放中比较基础指尖 IK 与加入弱姿态先验的方案：相对 ORCA 参考关节的 RMSE 为 23.56°→23.20°，相对参考指尖位置的平均误差为 32.22→32.05 mm，IK 目标残差为 2.84→2.86 mm。</w:t>
+              <w:t>实验设计与结果｜从 223 条原始记录整理出 155 条训练、50 条按姿态 ID 留出的测试和 5 条诊断数据，避免同一姿态的重复记录跨入训练与测试。在离线运动学回放中对比基础指尖 IK 与加入姿态偏好的方案：相对 ORCA 参考关节 RMSE 为 23.56°→23.20°，参考指尖平均误差为 32.22→32.05 mm，IK 目标残差为 2.84→2.86 mm。</w:t>
             </w:r>
           </w:p>
           <w:tbl>
@@ -664,7 +664,7 @@
                       <w:color w:val="202B31"/>
                       <w:sz w:val="19"/>
                     </w:rPr>
-                    <w:t>SIGNSPEAK 多模态情感转译手语手套</w:t>
+                    <w:t>SIGNSPEAK 情感反馈手语手套</w:t>
                   </w:r>
                   <w:r>
                     <w:rPr>
@@ -711,7 +711,7 @@
                 <w:color w:val="202B31"/>
                 <w:sz w:val="18"/>
               </w:rPr>
-              <w:t>项目内容与个人工作｜除三维建模与 PPT 外，基本独立完成方案、硬件、Arduino 固件和 Python 程序；实现 BLE 传感采集与随机森林手势识别，集成 Wav2Vec2 声学分析、ASR/LLM 语义分析及显示和振动反馈。</w:t>
+              <w:t>目标、方法与个人工作｜面向手势与情绪沟通，系统分两条链路：五指传感器和 MPU6050 经 BLE 采集动作，整理特征并用随机森林识别预定义手势；语音通道用 Wav2Vec2+MLP 分析声学情绪、用 ASR 转写并由 LLM 分析语义，再融合为 OLED 显示和振动反馈。除三维建模与 PPT 外，基本独立完成硬件搭建、Arduino 固件、数据采集、模型训练和程序集成。</w:t>
             </w:r>
           </w:p>
           <w:p>
@@ -724,9 +724,9 @@
                 <w:rFonts w:ascii="Calibri" w:hAnsi="Calibri" w:eastAsia="微软雅黑"/>
                 <w:b w:val="0"/>
                 <w:color w:val="5B6870"/>
-                <w:sz w:val="17"/>
+                <w:sz w:val="18"/>
               </w:rPr>
-              <w:t>项目结果｜完成可穿戴原型及手势采集—训练—预测流程，集成声学、语义和触觉反馈。</w:t>
+              <w:t>项目成果｜完成可穿戴原型及手势采集、训练、预测链路，并集成声学/语义分析与显示、振动反馈；作品获未来设计师 NCDA 全国总决赛本科生组三等奖（第二作者）。</w:t>
             </w:r>
           </w:p>
           <w:tbl>
@@ -819,7 +819,7 @@
                 <w:color w:val="202B31"/>
                 <w:sz w:val="18"/>
               </w:rPr>
-              <w:t>项目内容与个人工作｜负责桌面智能体、状态与偏好记忆及决策逻辑；连接华为云 IoTDA 与实体设备，整合命令解释、动作派发和状态回读，推进端云系统联调。</w:t>
+              <w:t>系统目标、实现与个人工作｜目标是把自然语言控制意图转成设备动作并反馈真实状态。负责桌面智能体、状态/偏好记忆与决策逻辑，连接华为云 IoTDA 和嵌入式设备接口，将命令解析、动作派发、设备状态回读串成端云控制链路，并协调系统联调。</w:t>
             </w:r>
           </w:p>
           <w:p>
@@ -832,9 +832,9 @@
                 <w:rFonts w:ascii="Calibri" w:hAnsi="Calibri" w:eastAsia="微软雅黑"/>
                 <w:b w:val="0"/>
                 <w:color w:val="5B6870"/>
-                <w:sz w:val="17"/>
+                <w:sz w:val="18"/>
               </w:rPr>
-              <w:t>项目进展｜完成端云设备联调与演示；当前正备战国创赛省赛金奖争夺赛。</w:t>
+              <w:t>项目成果｜完成端云设备联调与演示，获华为 OPC 大赛优秀奖；星居 AI 正备战中国国际大学生创新大赛省赛金奖争夺赛。</w:t>
             </w:r>
           </w:p>
           <w:tbl>
@@ -880,7 +880,7 @@
                       <w:color w:val="202B31"/>
                       <w:sz w:val="19"/>
                     </w:rPr>
-                    <w:t>机器人与智能车工程实践</w:t>
+                    <w:t>屠龙勇士智能车与机器人竞赛</w:t>
                   </w:r>
                   <w:r>
                     <w:rPr>
@@ -889,7 +889,7 @@
                       <w:color w:val="3B7391"/>
                       <w:sz w:val="16"/>
                     </w:rPr>
-                    <w:t xml:space="preserve">  |  屠龙队长 · 校机器人队</w:t>
+                    <w:t xml:space="preserve">  |  智能车队长 · 机器人队员</w:t>
                   </w:r>
                 </w:p>
               </w:tc>
@@ -936,7 +936,7 @@
                 <w:color w:val="202B31"/>
                 <w:sz w:val="18"/>
               </w:rPr>
-              <w:t>项目内容与个人工作｜担任屠龙队队长，参与底盘与传感器搭建、电机接入、嵌入式固件调试及赛道测试，组织多轮软硬件联调。</w:t>
+              <w:t>工程目标、实现与个人工作｜围绕整车循迹与避障，迭代循迹/PID、蓝牙遥控、超声波避障及环岛/直角场景程序；担任屠龙队长，负责底盘、传感器与电机接入、Arduino 固件调试及赛道联调，并参与追梦杯机器人实物调试。</w:t>
             </w:r>
           </w:p>
           <w:p>
@@ -949,9 +949,9 @@
                 <w:rFonts w:ascii="Calibri" w:hAnsi="Calibri" w:eastAsia="微软雅黑"/>
                 <w:b w:val="0"/>
                 <w:color w:val="5B6870"/>
-                <w:sz w:val="17"/>
+                <w:sz w:val="18"/>
               </w:rPr>
-              <w:t>项目结果｜完成不同机器人平台的搭建、调试与赛道验证，积累软硬件协同经验。</w:t>
+              <w:t>竞赛成果｜屠龙勇士智能车大赛校二等奖（队长）；追梦杯机器人竞赛校三等奖。</w:t>
             </w:r>
           </w:p>
           <w:p>
@@ -982,37 +982,7 @@
                 <w:rFonts w:ascii="Calibri" w:hAnsi="Calibri" w:eastAsia="微软雅黑"/>
                 <w:b w:val="0"/>
                 <w:color w:val="202B31"/>
-                <w:sz w:val="16"/>
-              </w:rPr>
-              <w:t>•  第十四届未来设计师 NCDA 全国总决赛三等奖（第二作者）</w:t>
-            </w:r>
-          </w:p>
-          <w:p>
-            <w:pPr>
-              <w:keepLines/>
-              <w:spacing w:before="0" w:after="24" w:line="250" w:lineRule="auto"/>
-            </w:pPr>
-            <w:r>
-              <w:rPr>
-                <w:rFonts w:ascii="Calibri" w:hAnsi="Calibri" w:eastAsia="微软雅黑"/>
-                <w:b w:val="0"/>
-                <w:color w:val="202B31"/>
-                <w:sz w:val="16"/>
-              </w:rPr>
-              <w:t>•  华为 OPC 大赛优秀奖（星居项目负责人）</w:t>
-            </w:r>
-          </w:p>
-          <w:p>
-            <w:pPr>
-              <w:keepLines/>
-              <w:spacing w:before="0" w:after="24" w:line="250" w:lineRule="auto"/>
-            </w:pPr>
-            <w:r>
-              <w:rPr>
-                <w:rFonts w:ascii="Calibri" w:hAnsi="Calibri" w:eastAsia="微软雅黑"/>
-                <w:b w:val="0"/>
-                <w:color w:val="202B31"/>
-                <w:sz w:val="16"/>
+                <w:sz w:val="17"/>
               </w:rPr>
               <w:t>•  全国大学生光电设计竞赛华北区二等奖（第二作者）</w:t>
             </w:r>
@@ -1027,7 +997,7 @@
                 <w:rFonts w:ascii="Calibri" w:hAnsi="Calibri" w:eastAsia="微软雅黑"/>
                 <w:b w:val="0"/>
                 <w:color w:val="202B31"/>
-                <w:sz w:val="16"/>
+                <w:sz w:val="17"/>
               </w:rPr>
               <w:t>•  “青创北京·挑战杯”首都大学生创业计划竞赛三等奖（团队成员）</w:t>
             </w:r>
@@ -1042,9 +1012,9 @@
                 <w:rFonts w:ascii="Calibri" w:hAnsi="Calibri" w:eastAsia="微软雅黑"/>
                 <w:b w:val="0"/>
                 <w:color w:val="202B31"/>
-                <w:sz w:val="16"/>
+                <w:sz w:val="17"/>
               </w:rPr>
-              <w:t>•  《英语世界》杯全国大学生翻译大赛本科生组全国二等奖；NETCCS C 类省级三等奖</w:t>
+              <w:t>•  《英语世界》杯本科生组全国二等奖；NETCCS C 类省级三等奖</w:t>
             </w:r>
           </w:p>
           <w:p>
@@ -1057,7 +1027,7 @@
                 <w:rFonts w:ascii="Calibri" w:hAnsi="Calibri" w:eastAsia="微软雅黑"/>
                 <w:b w:val="0"/>
                 <w:color w:val="202B31"/>
-                <w:sz w:val="16"/>
+                <w:sz w:val="17"/>
               </w:rPr>
               <w:t>•  蓝桥杯 C/C++ 大学 A 组、码蹄杯北京赛区三等奖</w:t>
             </w:r>
@@ -1072,22 +1042,7 @@
                 <w:rFonts w:ascii="Calibri" w:hAnsi="Calibri" w:eastAsia="微软雅黑"/>
                 <w:b w:val="0"/>
                 <w:color w:val="202B31"/>
-                <w:sz w:val="16"/>
-              </w:rPr>
-              <w:t>•  第十一届屠龙勇士智能车大赛校二等奖（队长）；追梦杯机器人竞赛校三等奖</w:t>
-            </w:r>
-          </w:p>
-          <w:p>
-            <w:pPr>
-              <w:keepLines/>
-              <w:spacing w:before="0" w:after="24" w:line="250" w:lineRule="auto"/>
-            </w:pPr>
-            <w:r>
-              <w:rPr>
-                <w:rFonts w:ascii="Calibri" w:hAnsi="Calibri" w:eastAsia="微软雅黑"/>
-                <w:b w:val="0"/>
-                <w:color w:val="202B31"/>
-                <w:sz w:val="16"/>
+                <w:sz w:val="17"/>
               </w:rPr>
               <w:t>•  “博约杯”新生物理竞赛校一等奖</w:t>
             </w:r>

</xml_diff>